<commit_message>
Require MySQL and align final docs
</commit_message>
<xml_diff>
--- a/deliverables/Java_모의주식투자_개인프로젝트_보고서_최종정합본.docx
+++ b/deliverables/Java_모의주식투자_개인프로젝트_보고서_최종정합본.docx
@@ -254,7 +254,7 @@
                 <w:b w:val="0"/>
                 <w:sz w:val="18"/>
               </w:rPr>
-              <w:t>MySQL 설정 시 테이블 저장, 미설정 시 메모리 모드</w:t>
+              <w:t>MySQL 필수 테이블 저장</w:t>
             </w:r>
           </w:p>
         </w:tc>
@@ -395,7 +395,7 @@
         <w:spacing w:after="60"/>
       </w:pPr>
       <w:r>
-        <w:t>MySQL 설정 시 회원/보유/거래 기록 유지</w:t>
+        <w:t>MySQL을 통한 회원/보유/거래 기록 유지</w:t>
       </w:r>
     </w:p>
     <w:p>
@@ -832,7 +832,7 @@
                 <w:b w:val="0"/>
                 <w:sz w:val="18"/>
               </w:rPr>
-              <w:t>MySQL 설정 시 테이블 저장</w:t>
+              <w:t>MySQL 필수 테이블 저장</w:t>
             </w:r>
           </w:p>
         </w:tc>
@@ -917,7 +917,7 @@
         <w:spacing w:after="120"/>
       </w:pPr>
       <w:r>
-        <w:t>프로젝트는 Spring이나 React 없이 Java 표준 기능을 중심으로 구성했다. HttpServer로 웹 서버를 열고, HttpClient로 외부 API를 호출하며, HTML/CSS/JavaScript는 Java 문자열 템플릿에서 렌더링한다. 저장은 MySQL JDBC 구조를 사용하되, MySQL 환경변수가 없으면 테스트용 메모리 모드로 실행된다.</w:t>
+        <w:t>프로젝트는 Spring이나 React 없이 Java 표준 기능을 중심으로 구성했다. HttpServer로 웹 서버를 열고, HttpClient로 외부 API를 호출하며, HTML/CSS/JavaScript는 Java 문자열 템플릿에서 렌더링한다. 저장은 MySQL JDBC 구조를 필수로 사용하며, MySQL 환경변수가 없거나 DB 연결에 실패하면 서버가 시작되지 않는다.</w:t>
       </w:r>
     </w:p>
     <w:tbl>
@@ -1272,7 +1272,7 @@
                 <w:b w:val="0"/>
                 <w:sz w:val="18"/>
               </w:rPr>
-              <w:t>업종·테마별 종목 분류 타입</w:t>
+              <w:t>업종·테마별 위험 설명 타입</w:t>
             </w:r>
           </w:p>
         </w:tc>
@@ -2015,7 +2015,7 @@
                 <w:b w:val="0"/>
                 <w:sz w:val="18"/>
               </w:rPr>
-              <w:t>MySQL 설정 시 회원/보유 종목/거래 기록 저장, 미설정 시 메모리 모드</w:t>
+              <w:t>회원/보유 종목/거래 기록을 MySQL에 필수 저장</w:t>
             </w:r>
           </w:p>
         </w:tc>
@@ -2269,7 +2269,7 @@
                 <w:b w:val="0"/>
                 <w:sz w:val="18"/>
               </w:rPr>
-              <w:t>회사 설명과 업종/위험 설명을 공통 규칙으로 정리</w:t>
+              <w:t>회사 설명과 업종 위험 설명을 종목 상세 설명에 반영</w:t>
             </w:r>
           </w:p>
         </w:tc>
@@ -2431,7 +2431,7 @@
         <w:spacing w:after="120"/>
       </w:pPr>
       <w:r>
-        <w:t>과제 조건상 클래스와 인터페이스 수가 많아야 했기 때문에 단순히 빈 클래스를 늘리기보다 종목 회사 설명과 업종 분류 구조를 분리했다. CompanyProfile은 회사명과 업종처럼 공통 속성을 갖는 추상 클래스이고, StockCategoryProfile은 업종명과 위험 설명을 제공하는 인터페이스다.</w:t>
+        <w:t>과제 조건상 클래스와 인터페이스 수가 많아야 했기 때문에 단순히 빈 클래스를 늘리기보다 종목 회사 설명과 업종 분류 구조를 분리했다. CompanyProfile은 회사명과 업종처럼 공통 속성을 갖는 추상 클래스이고, StockCategoryProfile은 업종명과 위험 설명을 제공하는 인터페이스다. 이 정보는 MiniProject.addStock()에서 종목 상세 설명을 보강할 때 실제로 사용된다.</w:t>
       </w:r>
     </w:p>
     <w:tbl>
@@ -3417,7 +3417,7 @@
                 <w:b w:val="0"/>
                 <w:sz w:val="18"/>
               </w:rPr>
-              <w:t>MySQL 설정 시 회원 정보, 보유 주식, 거래 기록을 테이블에 저장</w:t>
+              <w:t>회원 정보, 보유 주식, 거래 기록을 MySQL 테이블에 저장</w:t>
             </w:r>
           </w:p>
         </w:tc>
@@ -4638,7 +4638,7 @@
                 <w:b w:val="0"/>
                 <w:sz w:val="18"/>
               </w:rPr>
-              <w:t>MySQL 설정 시 members, shares, trade_logs 테이블 저장 / 미설정 시 메모리 모드</w:t>
+              <w:t>MySQL members, shares, trade_logs 테이블 저장</w:t>
             </w:r>
           </w:p>
         </w:tc>
@@ -5348,7 +5348,7 @@
                 <w:b w:val="0"/>
                 <w:sz w:val="18"/>
               </w:rPr>
-              <w:t>없음</w:t>
+              <w:t>필수</w:t>
             </w:r>
           </w:p>
         </w:tc>
@@ -5368,7 +5368,7 @@
                 <w:b w:val="0"/>
                 <w:sz w:val="18"/>
               </w:rPr>
-              <w:t>설정 시 MySQL 저장, 미설정 시 메모리 모드</w:t>
+              <w:t>MySQL 연결 정보, 없거나 연결 실패 시 서버 시작 중단</w:t>
             </w:r>
           </w:p>
         </w:tc>
@@ -5934,7 +5934,7 @@
                 <w:b w:val="0"/>
                 <w:sz w:val="18"/>
               </w:rPr>
-              <w:t>매수/매도 기록을 MySQL 설정 시 저장</w:t>
+              <w:t>매수/매도 기록을 MySQL에 저장</w:t>
             </w:r>
           </w:p>
         </w:tc>
@@ -6375,7 +6375,7 @@
         <w:spacing w:after="120"/>
       </w:pPr>
       <w:r>
-        <w:t>최종 결과물은 Java로 직접 만든 모의주식투자 웹앱이다. 한국투자증권 KIS API로 시세와 거래량을 가져오고, MySQL 환경이 설정된 경우 회원·보유주식·거래기록을 DB에 저장한다. 사용자는 종목을 검색하거나 즐겨찾기하고, 상세 화면에서 가격 그래프를 확인한 뒤 매수/매도를 진행할 수 있다.</w:t>
+        <w:t>최종 결과물은 Java로 직접 만든 모의주식투자 웹앱이다. 한국투자증권 KIS API로 시세와 거래량을 가져오고, 회원·보유주식·거래기록은 MySQL DB에 저장한다. 사용자는 종목을 검색하거나 즐겨찾기하고, 상세 화면에서 가격 그래프를 확인한 뒤 매수/매도를 진행할 수 있다.</w:t>
       </w:r>
     </w:p>
     <w:p>

</xml_diff>

<commit_message>
Simplify project flow without login
</commit_message>
<xml_diff>
--- a/deliverables/Java_모의주식투자_개인프로젝트_보고서_최종정합본.docx
+++ b/deliverables/Java_모의주식투자_개인프로젝트_보고서_최종정합본.docx
@@ -168,7 +168,7 @@
                 <w:b w:val="0"/>
                 <w:sz w:val="18"/>
               </w:rPr>
-              <w:t>Java HttpServer, HttpClient, Thread, Collection, JDBC, MySQL, 쿠키 세션, SHA-256 비밀번호 해시</w:t>
+              <w:t>Java HttpServer, HttpClient, Thread, Collection, JDBC, MySQL</w:t>
             </w:r>
           </w:p>
         </w:tc>
@@ -360,7 +360,7 @@
         <w:spacing w:after="120"/>
       </w:pPr>
       <w:r>
-        <w:t>본 프로젝트는 Java 표준 라이브러리 기반의 모의주식투자 웹앱이다. 사용자는 웹 브라우저에서 로그인한 뒤 국내 주식 종목을 확인하고, 관심 있는 종목을 클릭해 상세 정보를 본 다음 매수할 수 있다. 이미 산 종목은 보유 탭에서 수량을 지정해 매도한다.</w:t>
+        <w:t>본 프로젝트는 Java 표준 라이브러리 기반의 모의주식투자 웹앱이다. 사용자는 웹 브라우저에서 바로 국내 주식 종목을 확인하고, 관심 있는 종목을 클릭해 상세 정보를 본 다음 매수할 수 있다. 이미 산 종목은 보유 탭에서 수량을 지정해 매도한다.</w:t>
       </w:r>
     </w:p>
     <w:p>
@@ -395,7 +395,7 @@
         <w:spacing w:after="60"/>
       </w:pPr>
       <w:r>
-        <w:t>MySQL을 통한 회원/보유/거래 기록 유지</w:t>
+        <w:t>MySQL을 통한 과제용 투자자/보유/거래 기록 유지</w:t>
       </w:r>
     </w:p>
     <w:p>
@@ -1100,7 +1100,7 @@
                 <w:b w:val="0"/>
                 <w:sz w:val="18"/>
               </w:rPr>
-              <w:t>회원가입, 로그인 세션, 매매, 포트폴리오, 시세 상태 관리</w:t>
+              <w:t>과제용 투자자, 매매, 포트폴리오, 시세 상태 관리</w:t>
             </w:r>
           </w:p>
         </w:tc>
@@ -1407,48 +1407,6 @@
           </w:p>
         </w:tc>
       </w:tr>
-      <w:tr>
-        <w:tc>
-          <w:tcPr>
-            <w:tcW w:type="dxa" w:w="3024"/>
-            <w:vAlign w:val="center"/>
-          </w:tcPr>
-          <w:p>
-            <w:pPr>
-              <w:spacing w:after="0"/>
-            </w:pPr>
-            <w:r/>
-            <w:r>
-              <w:rPr>
-                <w:rFonts w:ascii="맑은 고딕" w:hAnsi="맑은 고딕" w:eastAsia="맑은 고딕"/>
-                <w:b w:val="0"/>
-                <w:sz w:val="18"/>
-              </w:rPr>
-              <w:t>PasswordHasher.java</w:t>
-            </w:r>
-          </w:p>
-        </w:tc>
-        <w:tc>
-          <w:tcPr>
-            <w:tcW w:type="dxa" w:w="7488"/>
-            <w:vAlign w:val="center"/>
-          </w:tcPr>
-          <w:p>
-            <w:pPr>
-              <w:spacing w:after="0"/>
-            </w:pPr>
-            <w:r/>
-            <w:r>
-              <w:rPr>
-                <w:rFonts w:ascii="맑은 고딕" w:hAnsi="맑은 고딕" w:eastAsia="맑은 고딕"/>
-                <w:b w:val="0"/>
-                <w:sz w:val="18"/>
-              </w:rPr>
-              <w:t>비밀번호 Salt 생성, SHA-256 해시, 기존 평문 비밀번호 자동 업그레이드</w:t>
-            </w:r>
-          </w:p>
-        </w:tc>
-      </w:tr>
     </w:tbl>
     <w:p/>
     <w:p>
@@ -1496,7 +1454,7 @@
         <w:spacing w:after="120"/>
       </w:pPr>
       <w:r>
-        <w:t>프로젝트는 현재 과제 제출과 단일 javac 컴파일을 쉽게 하기 위해 루트 디렉터리 중심으로 구성했다. 다만 내부 역할은 서버, 핵심 서비스, 도메인 모델, 외부 시세, 저장소, 보안, 화면 생성으로 나누어 볼 수 있다. 발표에서는 아래 표를 기준으로 어떤 클래스가 어떤 Java 라이브러리를 사용했는지 설명하면 된다.</w:t>
+        <w:t>프로젝트는 현재 과제 제출과 단일 javac 컴파일을 쉽게 하기 위해 루트 디렉터리 중심으로 구성했다. 다만 내부 역할은 서버, 핵심 서비스, 도메인 모델, 외부 시세, 저장소, 화면 생성으로 나누어 볼 수 있다. 발표에서는 아래 표를 기준으로 어떤 클래스가 어떤 Java 라이브러리를 사용했는지 설명하면 된다.</w:t>
       </w:r>
     </w:p>
     <w:tbl>
@@ -1847,7 +1805,7 @@
                 <w:b w:val="0"/>
                 <w:sz w:val="18"/>
               </w:rPr>
-              <w:t>회원, 종목, 보유 수량, 거래 기록, 가격 이력 표현</w:t>
+              <w:t>과제용 투자자, 종목, 보유 수량, 거래 기록, 가격 이력 표현</w:t>
             </w:r>
           </w:p>
         </w:tc>
@@ -2015,7 +1973,7 @@
                 <w:b w:val="0"/>
                 <w:sz w:val="18"/>
               </w:rPr>
-              <w:t>회원/보유 종목/거래 기록을 MySQL에 필수 저장</w:t>
+              <w:t>투자자/보유 종목/거래 기록을 MySQL에 필수 저장</w:t>
             </w:r>
           </w:p>
         </w:tc>
@@ -2038,7 +1996,7 @@
                 <w:b w:val="0"/>
                 <w:sz w:val="18"/>
               </w:rPr>
-              <w:t>보안/세션 계층</w:t>
+              <w:t>화면/직렬화 계층</w:t>
             </w:r>
           </w:p>
         </w:tc>
@@ -2059,7 +2017,7 @@
                 <w:b w:val="0"/>
                 <w:sz w:val="18"/>
               </w:rPr>
-              <w:t>PasswordHasher, MiniHandler</w:t>
+              <w:t>WebPages, Json</w:t>
             </w:r>
           </w:p>
         </w:tc>
@@ -2080,7 +2038,7 @@
                 <w:b w:val="0"/>
                 <w:sz w:val="18"/>
               </w:rPr>
-              <w:t>SecureRandom, MessageDigest, Base64, Cookie</w:t>
+              <w:t>HTML/CSS/JavaScript 문자열, JSON 생성/파싱</w:t>
             </w:r>
           </w:p>
         </w:tc>
@@ -2088,88 +2046,6 @@
           <w:tcPr>
             <w:tcW w:type="dxa" w:w="3312"/>
             <w:shd w:fill="F6F9FD"/>
-            <w:vAlign w:val="center"/>
-          </w:tcPr>
-          <w:p>
-            <w:pPr>
-              <w:spacing w:after="0"/>
-            </w:pPr>
-            <w:r/>
-            <w:r>
-              <w:rPr>
-                <w:rFonts w:ascii="맑은 고딕" w:hAnsi="맑은 고딕" w:eastAsia="맑은 고딕"/>
-                <w:b w:val="0"/>
-                <w:sz w:val="18"/>
-              </w:rPr>
-              <w:t>비밀번호 Salt 해시, 세션 쿠키 발급, 로그인 상태 관리</w:t>
-            </w:r>
-          </w:p>
-        </w:tc>
-      </w:tr>
-      <w:tr>
-        <w:tc>
-          <w:tcPr>
-            <w:tcW w:type="dxa" w:w="1944"/>
-            <w:vAlign w:val="center"/>
-          </w:tcPr>
-          <w:p>
-            <w:pPr>
-              <w:spacing w:after="0"/>
-            </w:pPr>
-            <w:r/>
-            <w:r>
-              <w:rPr>
-                <w:rFonts w:ascii="맑은 고딕" w:hAnsi="맑은 고딕" w:eastAsia="맑은 고딕"/>
-                <w:b w:val="0"/>
-                <w:sz w:val="18"/>
-              </w:rPr>
-              <w:t>화면/직렬화 계층</w:t>
-            </w:r>
-          </w:p>
-        </w:tc>
-        <w:tc>
-          <w:tcPr>
-            <w:tcW w:type="dxa" w:w="3024"/>
-            <w:vAlign w:val="center"/>
-          </w:tcPr>
-          <w:p>
-            <w:pPr>
-              <w:spacing w:after="0"/>
-            </w:pPr>
-            <w:r/>
-            <w:r>
-              <w:rPr>
-                <w:rFonts w:ascii="맑은 고딕" w:hAnsi="맑은 고딕" w:eastAsia="맑은 고딕"/>
-                <w:b w:val="0"/>
-                <w:sz w:val="18"/>
-              </w:rPr>
-              <w:t>WebPages, Json</w:t>
-            </w:r>
-          </w:p>
-        </w:tc>
-        <w:tc>
-          <w:tcPr>
-            <w:tcW w:type="dxa" w:w="3168"/>
-            <w:vAlign w:val="center"/>
-          </w:tcPr>
-          <w:p>
-            <w:pPr>
-              <w:spacing w:after="0"/>
-            </w:pPr>
-            <w:r/>
-            <w:r>
-              <w:rPr>
-                <w:rFonts w:ascii="맑은 고딕" w:hAnsi="맑은 고딕" w:eastAsia="맑은 고딕"/>
-                <w:b w:val="0"/>
-                <w:sz w:val="18"/>
-              </w:rPr>
-              <w:t>HTML/CSS/JavaScript 문자열, JSON 생성/파싱</w:t>
-            </w:r>
-          </w:p>
-        </w:tc>
-        <w:tc>
-          <w:tcPr>
-            <w:tcW w:type="dxa" w:w="3312"/>
             <w:vAlign w:val="center"/>
           </w:tcPr>
           <w:p>
@@ -2192,7 +2068,6 @@
         <w:tc>
           <w:tcPr>
             <w:tcW w:type="dxa" w:w="1944"/>
-            <w:shd w:fill="F6F9FD"/>
             <w:vAlign w:val="center"/>
           </w:tcPr>
           <w:p>
@@ -2213,7 +2088,6 @@
         <w:tc>
           <w:tcPr>
             <w:tcW w:type="dxa" w:w="3024"/>
-            <w:shd w:fill="F6F9FD"/>
             <w:vAlign w:val="center"/>
           </w:tcPr>
           <w:p>
@@ -2234,7 +2108,6 @@
         <w:tc>
           <w:tcPr>
             <w:tcW w:type="dxa" w:w="3168"/>
-            <w:shd w:fill="F6F9FD"/>
             <w:vAlign w:val="center"/>
           </w:tcPr>
           <w:p>
@@ -2255,7 +2128,6 @@
         <w:tc>
           <w:tcPr>
             <w:tcW w:type="dxa" w:w="3312"/>
-            <w:shd w:fill="F6F9FD"/>
             <w:vAlign w:val="center"/>
           </w:tcPr>
           <w:p>
@@ -2311,21 +2183,19 @@
           <w:rFonts w:ascii="Consolas" w:hAnsi="Consolas"/>
           <w:sz w:val="17"/>
         </w:rPr>
-        <w:t>// MiniHandler.java - 세션 쿠키를 읽고 HTTP 요청을 기능별 메서드로 연결</w:t>
-        <w:br/>
-        <w:t>String sessionId = sessionCookie(exchange);</w:t>
+        <w:t>// MiniHandler.java - HTTP 요청을 기능별 메서드로 연결</w:t>
         <w:br/>
         <w:t>if ("GET".equals(method) &amp;&amp; "/api/state".equals(path)) {</w:t>
         <w:br/>
-        <w:t xml:space="preserve">    send(exchange, 200, "application/json", project.stateJson(sessionId));</w:t>
+        <w:t xml:space="preserve">    send(exchange, 200, "application/json", project.stateJson());</w:t>
         <w:br/>
         <w:t>}</w:t>
         <w:br/>
         <w:t>String json = switch (path) {</w:t>
         <w:br/>
-        <w:t xml:space="preserve">    case "/api/stock/buy" -&gt; project.buyStock(body, sessionId);</w:t>
+        <w:t xml:space="preserve">    case "/api/stock/buy" -&gt; project.buyStock(body);</w:t>
         <w:br/>
-        <w:t xml:space="preserve">    case "/api/stock/sell" -&gt; project.sellStock(body, sessionId);</w:t>
+        <w:t xml:space="preserve">    case "/api/stock/sell" -&gt; project.sellStock(body);</w:t>
         <w:br/>
         <w:t xml:space="preserve">    default -&gt; Json.obj("ok", false, "error", "없는 API");</w:t>
         <w:br/>
@@ -2373,7 +2243,7 @@
         </w:rPr>
         <w:t>// MiniProject.java - 매수 처리와 거래 기록 저장</w:t>
         <w:br/>
-        <w:t>Member member = member(sessionId);</w:t>
+        <w:t>Member member = defaultMember();</w:t>
         <w:br/>
         <w:t>Stock stock = member.stocks.get(stockName);</w:t>
         <w:br/>
@@ -3136,7 +3006,7 @@
         <w:spacing w:after="60"/>
       </w:pPr>
       <w:r>
-        <w:t>웹사이트 접속 후 로그인한다.</w:t>
+        <w:t>웹사이트에 접속하면 과제용 투자자 화면이 바로 열린다.</w:t>
       </w:r>
     </w:p>
     <w:p>
@@ -3287,7 +3157,7 @@
                 <w:b w:val="0"/>
                 <w:sz w:val="18"/>
               </w:rPr>
-              <w:t>로그인 정보, 종목 선택, 즐겨찾기, 매수/매도 수량</w:t>
+              <w:t>종목 선택, 즐겨찾기, 매수/매도 수량</w:t>
             </w:r>
           </w:p>
         </w:tc>
@@ -3417,7 +3287,7 @@
                 <w:b w:val="0"/>
                 <w:sz w:val="18"/>
               </w:rPr>
-              <w:t>회원 정보, 보유 주식, 거래 기록을 MySQL 테이블에 저장</w:t>
+              <w:t>과제용 투자자, 보유 주식, 거래 기록을 MySQL 테이블에 저장</w:t>
             </w:r>
           </w:p>
         </w:tc>
@@ -4200,7 +4070,7 @@
                 <w:b w:val="0"/>
                 <w:sz w:val="18"/>
               </w:rPr>
-              <w:t>SecureRandom / MessageDigest</w:t>
+              <w:t>Files / Path</w:t>
             </w:r>
           </w:p>
         </w:tc>
@@ -4208,48 +4078,6 @@
           <w:tcPr>
             <w:tcW w:type="dxa" w:w="7200"/>
             <w:shd w:fill="F6F9FD"/>
-            <w:vAlign w:val="center"/>
-          </w:tcPr>
-          <w:p>
-            <w:pPr>
-              <w:spacing w:after="0"/>
-            </w:pPr>
-            <w:r/>
-            <w:r>
-              <w:rPr>
-                <w:rFonts w:ascii="맑은 고딕" w:hAnsi="맑은 고딕" w:eastAsia="맑은 고딕"/>
-                <w:b w:val="0"/>
-                <w:sz w:val="18"/>
-              </w:rPr>
-              <w:t>비밀번호 Salt 생성과 SHA-256 해시 검증</w:t>
-            </w:r>
-          </w:p>
-        </w:tc>
-      </w:tr>
-      <w:tr>
-        <w:tc>
-          <w:tcPr>
-            <w:tcW w:type="dxa" w:w="3168"/>
-            <w:vAlign w:val="center"/>
-          </w:tcPr>
-          <w:p>
-            <w:pPr>
-              <w:spacing w:after="0"/>
-            </w:pPr>
-            <w:r/>
-            <w:r>
-              <w:rPr>
-                <w:rFonts w:ascii="맑은 고딕" w:hAnsi="맑은 고딕" w:eastAsia="맑은 고딕"/>
-                <w:b w:val="0"/>
-                <w:sz w:val="18"/>
-              </w:rPr>
-              <w:t>Files / Path</w:t>
-            </w:r>
-          </w:p>
-        </w:tc>
-        <w:tc>
-          <w:tcPr>
-            <w:tcW w:type="dxa" w:w="7200"/>
             <w:vAlign w:val="center"/>
           </w:tcPr>
           <w:p>
@@ -4272,7 +4100,6 @@
         <w:tc>
           <w:tcPr>
             <w:tcW w:type="dxa" w:w="3168"/>
-            <w:shd w:fill="F6F9FD"/>
             <w:vAlign w:val="center"/>
           </w:tcPr>
           <w:p>
@@ -4293,7 +4120,6 @@
         <w:tc>
           <w:tcPr>
             <w:tcW w:type="dxa" w:w="7200"/>
-            <w:shd w:fill="F6F9FD"/>
             <w:vAlign w:val="center"/>
           </w:tcPr>
           <w:p>
@@ -4316,6 +4142,7 @@
         <w:tc>
           <w:tcPr>
             <w:tcW w:type="dxa" w:w="3168"/>
+            <w:shd w:fill="F6F9FD"/>
             <w:vAlign w:val="center"/>
           </w:tcPr>
           <w:p>
@@ -4336,6 +4163,7 @@
         <w:tc>
           <w:tcPr>
             <w:tcW w:type="dxa" w:w="7200"/>
+            <w:shd w:fill="F6F9FD"/>
             <w:vAlign w:val="center"/>
           </w:tcPr>
           <w:p>
@@ -4708,7 +4536,7 @@
           <w:rFonts w:ascii="Consolas" w:hAnsi="Consolas"/>
           <w:sz w:val="17"/>
         </w:rPr>
-        <w:t>members(uid, name, login_id, pwd, balance)</w:t>
+        <w:t>members(uid, name, balance)</w:t>
         <w:br/>
         <w:t>shares(member_uid, stock_name, quantity, purchase_price)</w:t>
         <w:br/>
@@ -5441,7 +5269,7 @@
         <w:pStyle w:val="Heading2"/>
       </w:pPr>
       <w:r>
-        <w:t>9.1 보안과 세션 관리 보완</w:t>
+        <w:t>9.1 로그인 기능 제거 판단</w:t>
       </w:r>
     </w:p>
     <w:p>
@@ -5449,7 +5277,7 @@
         <w:spacing w:after="120"/>
       </w:pPr>
       <w:r>
-        <w:t>초기 구조는 서버 안의 currentMember 필드로 로그인 사용자를 기억하고, 비밀번호도 평문에 가까운 형태로 저장했다. 이 방식은 한 명이 시험할 때는 단순하지만 여러 브라우저나 여러 사용자를 생각하면 맞지 않는다. 그래서 로그인 성공 시 서버가 세션 토큰을 발급하고, 브라우저에는 HttpOnly 쿠키인 MSTOCK_SESSION을 내려주는 방식으로 변경했다.</w:t>
+        <w:t>초기에는 회원가입과 로그인 기능을 넣었지만, 이 프로젝트는 실제 사용자에게 배포하는 서비스가 아니라 과제 발표용 모의투자 프로그램이다. 그래서 인증 기능보다 시세 조회, 종목 선택, 매수/매도, 손익 계산 흐름을 설명하는 것이 더 중요하다고 판단했다. 최종 버전에서는 서버가 MySQL에 저장된 과제용 투자자 한 명을 사용하고, 사용자는 로그인 없이 바로 모의투자를 진행한다.</w:t>
       </w:r>
     </w:p>
     <w:p>
@@ -5458,7 +5286,7 @@
         <w:spacing w:after="60"/>
       </w:pPr>
       <w:r>
-        <w:t>회원가입 시 비밀번호를 그대로 저장하지 않고 Salt와 SHA-256 해시 조합으로 저장한다.</w:t>
+        <w:t>발표 시작 후 바로 시장 시세와 포트폴리오 화면을 보여줄 수 있다.</w:t>
       </w:r>
     </w:p>
     <w:p>
@@ -5467,7 +5295,7 @@
         <w:spacing w:after="60"/>
       </w:pPr>
       <w:r>
-        <w:t>기존에 평문으로 남아 있던 비밀번호는 로그인 성공 시 해시 형태로 자동 업그레이드한다.</w:t>
+        <w:t>DB에는 과제용 투자자의 현금, 보유 종목, 거래 기록만 저장한다.</w:t>
       </w:r>
     </w:p>
     <w:p>
@@ -5476,7 +5304,7 @@
         <w:spacing w:after="60"/>
       </w:pPr>
       <w:r>
-        <w:t>각 요청은 쿠키의 세션 토큰으로 회원을 찾기 때문에 서버 전체 currentMember 하나에 의존하지 않는다.</w:t>
+        <w:t>회원 인증과 비밀번호 보안 설명보다 Java 서버, KIS API, MySQL 저장 흐름에 집중한다.</w:t>
       </w:r>
     </w:p>
     <w:p>
@@ -5485,7 +5313,7 @@
         <w:spacing w:after="60"/>
       </w:pPr>
       <w:r>
-        <w:t>HTTPS 적용, 세션 만료 시간, CSRF 방어는 실제 배포 단계에서 추가해야 할 보완점으로 남겼다.</w:t>
+        <w:t>실제 배포 서비스로 확장한다면 그때 회원 인증, 세션, HTTPS를 추가하는 것이 적절하다.</w:t>
       </w:r>
     </w:p>
     <w:p>
@@ -5570,7 +5398,7 @@
                 <w:b w:val="0"/>
                 <w:sz w:val="18"/>
               </w:rPr>
-              <w:t>로그인/회원가입</w:t>
+              <w:t>과제용 투자자</w:t>
             </w:r>
           </w:p>
         </w:tc>
@@ -5590,7 +5418,7 @@
                 <w:b w:val="0"/>
                 <w:sz w:val="18"/>
               </w:rPr>
-              <w:t>테스트 계정과 신규 회원 생성 가능</w:t>
+              <w:t>로그인 없이 단일 투자자 데이터로 바로 실행</w:t>
             </w:r>
           </w:p>
         </w:tc>
@@ -6375,7 +6203,7 @@
         <w:spacing w:after="120"/>
       </w:pPr>
       <w:r>
-        <w:t>최종 결과물은 Java로 직접 만든 모의주식투자 웹앱이다. 한국투자증권 KIS API로 시세와 거래량을 가져오고, 회원·보유주식·거래기록은 MySQL DB에 저장한다. 사용자는 종목을 검색하거나 즐겨찾기하고, 상세 화면에서 가격 그래프를 확인한 뒤 매수/매도를 진행할 수 있다.</w:t>
+        <w:t>최종 결과물은 Java로 직접 만든 모의주식투자 웹앱이다. 한국투자증권 KIS API로 시세와 거래량을 가져오고, 과제용 투자자의 보유주식과 거래기록은 MySQL DB에 저장한다. 사용자는 종목을 검색하거나 즐겨찾기하고, 상세 화면에서 가격 그래프를 확인한 뒤 매수/매도를 진행할 수 있다.</w:t>
       </w:r>
     </w:p>
     <w:p>
@@ -6383,7 +6211,7 @@
         <w:spacing w:after="120"/>
       </w:pPr>
       <w:r>
-        <w:t>향후 개선한다면 실제 KIS 테스트베드에서 WebSocket 구독 성공 여부를 확인하고, controller, service, repository, model 패키지로 소스 구조를 분리하는 작업이 우선이다. 현재는 과제 제출과 컴파일 검증을 쉽게 하기 위해 루트 디렉터리 중심 구조를 유지했다. 이후에는 테스트 코드 추가, HTTPS 배포 환경 적용, 세션 만료 시간과 CSRF 방어, 업종별 위험 등급 UI 표시, 개인화 관심종목 추천 같은 기능을 확장할 수 있다.</w:t>
+        <w:t>향후 개선한다면 실제 KIS 테스트베드에서 WebSocket 구독 성공 여부를 확인하고, controller, service, repository, model 패키지로 소스 구조를 분리하는 작업이 우선이다. 현재는 과제 제출과 컴파일 검증을 쉽게 하기 위해 루트 디렉터리 중심 구조를 유지했다. 이후에는 테스트 코드 추가, 회원 인증이 필요한 배포 버전, 업종별 위험 등급 UI 표시, 개인화 관심종목 추천 같은 기능을 확장할 수 있다.</w:t>
       </w:r>
     </w:p>
     <w:sectPr>

</xml_diff>

<commit_message>
Allow local storage fallback for localhost demo
</commit_message>
<xml_diff>
--- a/deliverables/Java_모의주식투자_개인프로젝트_보고서_최종정합본.docx
+++ b/deliverables/Java_모의주식투자_개인프로젝트_보고서_최종정합본.docx
@@ -254,7 +254,7 @@
                 <w:b w:val="0"/>
                 <w:sz w:val="18"/>
               </w:rPr>
-              <w:t>MySQL 필수 테이블 저장</w:t>
+              <w:t>MySQL 우선 저장, 실패 시 로컬 파일 저장</w:t>
             </w:r>
           </w:p>
         </w:tc>
@@ -395,7 +395,7 @@
         <w:spacing w:after="60"/>
       </w:pPr>
       <w:r>
-        <w:t>MySQL을 통한 과제용 투자자/보유/거래 기록 유지</w:t>
+        <w:t>MySQL 또는 로컬 파일 저장소를 통한 과제용 투자자/보유/거래 기록 유지</w:t>
       </w:r>
     </w:p>
     <w:p>
@@ -832,7 +832,7 @@
                 <w:b w:val="0"/>
                 <w:sz w:val="18"/>
               </w:rPr>
-              <w:t>MySQL 필수 테이블 저장</w:t>
+              <w:t>MySQL 우선 저장, 실패 시 로컬 파일 저장</w:t>
             </w:r>
           </w:p>
         </w:tc>
@@ -917,7 +917,7 @@
         <w:spacing w:after="120"/>
       </w:pPr>
       <w:r>
-        <w:t>프로젝트는 Spring이나 React 없이 Java 표준 기능을 중심으로 구성했다. HttpServer로 웹 서버를 열고, HttpClient로 외부 API를 호출하며, HTML/CSS/JavaScript는 Java 문자열 템플릿에서 렌더링한다. 저장은 MySQL JDBC 구조를 필수로 사용하며, MySQL 환경변수가 없거나 DB 연결에 실패하면 서버가 시작되지 않는다.</w:t>
+        <w:t>프로젝트는 Spring이나 React 없이 Java 표준 기능을 중심으로 구성했다. HttpServer로 웹 서버를 열고, HttpClient로 외부 API를 호출하며, HTML/CSS/JavaScript는 Java 문자열 템플릿에서 렌더링한다. 저장은 MySQL JDBC 구조를 우선 사용하고, 로컬 과제 실행 환경에서 MySQL 인증이 실패하면 data/local-database.tsv 파일 저장소로 자동 전환한다.</w:t>
       </w:r>
     </w:p>
     <w:tbl>
@@ -1186,7 +1186,7 @@
                 <w:b w:val="0"/>
                 <w:sz w:val="18"/>
               </w:rPr>
-              <w:t>MySQL 연결, 테이블 생성, 데이터 저장/로드</w:t>
+              <w:t>MySQL 연결, 테이블 생성, 로컬 파일 저장 전환</w:t>
             </w:r>
           </w:p>
         </w:tc>
@@ -1933,7 +1933,7 @@
                 <w:b w:val="0"/>
                 <w:sz w:val="18"/>
               </w:rPr>
-              <w:t>MySqlDatabase, DatabaseSnapshot</w:t>
+              <w:t>MySqlDatabase, LocalFileDatabase, DatabaseSnapshot</w:t>
             </w:r>
           </w:p>
         </w:tc>
@@ -1953,7 +1953,7 @@
                 <w:b w:val="0"/>
                 <w:sz w:val="18"/>
               </w:rPr>
-              <w:t>JDBC, DriverManager, PreparedStatement, ResultSet</w:t>
+              <w:t>JDBC, DriverManager, Files, Path</w:t>
             </w:r>
           </w:p>
         </w:tc>
@@ -1973,7 +1973,7 @@
                 <w:b w:val="0"/>
                 <w:sz w:val="18"/>
               </w:rPr>
-              <w:t>투자자/보유 종목/거래 기록을 MySQL에 필수 저장</w:t>
+              <w:t>MySQL 우선 저장, 실패 시 로컬 파일 저장</w:t>
             </w:r>
           </w:p>
         </w:tc>
@@ -3287,7 +3287,7 @@
                 <w:b w:val="0"/>
                 <w:sz w:val="18"/>
               </w:rPr>
-              <w:t>과제용 투자자, 보유 주식, 거래 기록을 MySQL 테이블에 저장</w:t>
+              <w:t>과제용 투자자, 보유 주식, 거래 기록을 MySQL 또는 로컬 파일 저장소에 저장</w:t>
             </w:r>
           </w:p>
         </w:tc>
@@ -4466,7 +4466,7 @@
                 <w:b w:val="0"/>
                 <w:sz w:val="18"/>
               </w:rPr>
-              <w:t>MySQL members, shares, trade_logs 테이블 저장</w:t>
+              <w:t>MySQL 우선 저장, 실패 시 data/local-database.tsv 저장</w:t>
             </w:r>
           </w:p>
         </w:tc>
@@ -5176,7 +5176,7 @@
                 <w:b w:val="0"/>
                 <w:sz w:val="18"/>
               </w:rPr>
-              <w:t>필수</w:t>
+              <w:t>선택</w:t>
             </w:r>
           </w:p>
         </w:tc>
@@ -5196,7 +5196,7 @@
                 <w:b w:val="0"/>
                 <w:sz w:val="18"/>
               </w:rPr>
-              <w:t>MySQL 연결 정보, 없거나 연결 실패 시 서버 시작 중단</w:t>
+              <w:t>MySQL 연결 정보, 실패 시 로컬 파일 저장소로 전환</w:t>
             </w:r>
           </w:p>
         </w:tc>
@@ -5762,7 +5762,7 @@
                 <w:b w:val="0"/>
                 <w:sz w:val="18"/>
               </w:rPr>
-              <w:t>매수/매도 기록을 MySQL에 저장</w:t>
+              <w:t>매수/매도 기록을 저장소에 저장</w:t>
             </w:r>
           </w:p>
         </w:tc>
@@ -6203,7 +6203,7 @@
         <w:spacing w:after="120"/>
       </w:pPr>
       <w:r>
-        <w:t>최종 결과물은 Java로 직접 만든 모의주식투자 웹앱이다. 한국투자증권 KIS API로 시세와 거래량을 가져오고, 과제용 투자자의 보유주식과 거래기록은 MySQL DB에 저장한다. 사용자는 종목을 검색하거나 즐겨찾기하고, 상세 화면에서 가격 그래프를 확인한 뒤 매수/매도를 진행할 수 있다.</w:t>
+        <w:t>최종 결과물은 Java로 직접 만든 모의주식투자 웹앱이다. 한국투자증권 KIS API로 시세와 거래량을 가져오고, 과제용 투자자의 보유주식과 거래기록은 MySQL 또는 로컬 파일 저장소에 저장한다. 사용자는 종목을 검색하거나 즐겨찾기하고, 상세 화면에서 가격 그래프를 확인한 뒤 매수/매도를 진행할 수 있다.</w:t>
       </w:r>
     </w:p>
     <w:p>

</xml_diff>

<commit_message>
Remove assignment investor wording
</commit_message>
<xml_diff>
--- a/deliverables/Java_모의주식투자_개인프로젝트_보고서_최종정합본.docx
+++ b/deliverables/Java_모의주식투자_개인프로젝트_보고서_최종정합본.docx
@@ -395,7 +395,7 @@
         <w:spacing w:after="60"/>
       </w:pPr>
       <w:r>
-        <w:t>MySQL 또는 로컬 파일 저장소를 통한 과제용 투자자/보유/거래 기록 유지</w:t>
+        <w:t>MySQL 또는 로컬 파일 저장소를 통한 모의 계좌/보유/거래 기록 유지</w:t>
       </w:r>
     </w:p>
     <w:p>
@@ -1100,7 +1100,7 @@
                 <w:b w:val="0"/>
                 <w:sz w:val="18"/>
               </w:rPr>
-              <w:t>과제용 투자자, 매매, 포트폴리오, 시세 상태 관리</w:t>
+              <w:t>모의 계좌, 매매, 포트폴리오, 시세 상태 관리</w:t>
             </w:r>
           </w:p>
         </w:tc>
@@ -1805,7 +1805,7 @@
                 <w:b w:val="0"/>
                 <w:sz w:val="18"/>
               </w:rPr>
-              <w:t>과제용 투자자, 종목, 보유 수량, 거래 기록, 가격 이력 표현</w:t>
+              <w:t>모의 계좌, 종목, 보유 수량, 거래 기록, 가격 이력 표현</w:t>
             </w:r>
           </w:p>
         </w:tc>
@@ -3006,7 +3006,7 @@
         <w:spacing w:after="60"/>
       </w:pPr>
       <w:r>
-        <w:t>웹사이트에 접속하면 과제용 투자자 화면이 바로 열린다.</w:t>
+        <w:t>웹사이트에 접속하면 모의 계좌 화면이 바로 열린다.</w:t>
       </w:r>
     </w:p>
     <w:p>
@@ -3287,7 +3287,7 @@
                 <w:b w:val="0"/>
                 <w:sz w:val="18"/>
               </w:rPr>
-              <w:t>과제용 투자자, 보유 주식, 거래 기록을 MySQL 또는 로컬 파일 저장소에 저장</w:t>
+              <w:t>모의 계좌, 보유 주식, 거래 기록을 MySQL 또는 로컬 파일 저장소에 저장</w:t>
             </w:r>
           </w:p>
         </w:tc>
@@ -5277,7 +5277,7 @@
         <w:spacing w:after="120"/>
       </w:pPr>
       <w:r>
-        <w:t>초기에는 회원가입과 로그인 기능을 넣었지만, 이 프로젝트는 실제 사용자에게 배포하는 서비스가 아니라 과제 발표용 모의투자 프로그램이다. 그래서 인증 기능보다 시세 조회, 종목 선택, 매수/매도, 손익 계산 흐름을 설명하는 것이 더 중요하다고 판단했다. 최종 버전에서는 서버가 MySQL에 저장된 과제용 투자자 한 명을 사용하고, 사용자는 로그인 없이 바로 모의투자를 진행한다.</w:t>
+        <w:t>초기에는 회원가입과 로그인 기능을 넣었지만, 이 프로젝트는 실제 사용자에게 배포하는 서비스가 아니라 과제 발표용 모의투자 프로그램이다. 그래서 인증 기능보다 시세 조회, 종목 선택, 매수/매도, 손익 계산 흐름을 설명하는 것이 더 중요하다고 판단했다. 최종 버전에서는 서버가 MySQL에 저장된 모의 계좌 한 명을 사용하고, 사용자는 로그인 없이 바로 모의투자를 진행한다.</w:t>
       </w:r>
     </w:p>
     <w:p>
@@ -5295,7 +5295,7 @@
         <w:spacing w:after="60"/>
       </w:pPr>
       <w:r>
-        <w:t>DB에는 과제용 투자자의 현금, 보유 종목, 거래 기록만 저장한다.</w:t>
+        <w:t>DB에는 모의 계좌의 현금, 보유 종목, 거래 기록만 저장한다.</w:t>
       </w:r>
     </w:p>
     <w:p>
@@ -5398,7 +5398,7 @@
                 <w:b w:val="0"/>
                 <w:sz w:val="18"/>
               </w:rPr>
-              <w:t>과제용 투자자</w:t>
+              <w:t>모의 계좌</w:t>
             </w:r>
           </w:p>
         </w:tc>
@@ -5418,7 +5418,7 @@
                 <w:b w:val="0"/>
                 <w:sz w:val="18"/>
               </w:rPr>
-              <w:t>로그인 없이 단일 투자자 데이터로 바로 실행</w:t>
+              <w:t>로그인 없이 단일 모의 계좌 데이터로 바로 실행</w:t>
             </w:r>
           </w:p>
         </w:tc>
@@ -6203,7 +6203,7 @@
         <w:spacing w:after="120"/>
       </w:pPr>
       <w:r>
-        <w:t>최종 결과물은 Java로 직접 만든 모의주식투자 웹앱이다. 한국투자증권 KIS API로 시세와 거래량을 가져오고, 과제용 투자자의 보유주식과 거래기록은 MySQL 또는 로컬 파일 저장소에 저장한다. 사용자는 종목을 검색하거나 즐겨찾기하고, 상세 화면에서 가격 그래프를 확인한 뒤 매수/매도를 진행할 수 있다.</w:t>
+        <w:t>최종 결과물은 Java로 직접 만든 모의주식투자 웹앱이다. 한국투자증권 KIS API로 시세와 거래량을 가져오고, 모의 계좌의 보유주식과 거래기록은 MySQL 또는 로컬 파일 저장소에 저장한다. 사용자는 종목을 검색하거나 즐겨찾기하고, 상세 화면에서 가격 그래프를 확인한 뒤 매수/매도를 진행할 수 있다.</w:t>
       </w:r>
     </w:p>
     <w:p>

</xml_diff>

<commit_message>
Reorganize packages and refresh trading UI
</commit_message>
<xml_diff>
--- a/deliverables/Java_모의주식투자_개인프로젝트_보고서_최종정합본.docx
+++ b/deliverables/Java_모의주식투자_개인프로젝트_보고서_최종정합본.docx
@@ -994,7 +994,7 @@
                 <w:b w:val="0"/>
                 <w:sz w:val="18"/>
               </w:rPr>
-              <w:t>MiniProjectApp.java</w:t>
+              <w:t>app/MiniProjectApp.java</w:t>
             </w:r>
           </w:p>
         </w:tc>
@@ -1123,7 +1123,7 @@
                 <w:b w:val="0"/>
                 <w:sz w:val="18"/>
               </w:rPr>
-              <w:t>DomainModels.java</w:t>
+              <w:t>domain/Member.java, Stock.java</w:t>
             </w:r>
           </w:p>
         </w:tc>
@@ -1166,7 +1166,7 @@
                 <w:b w:val="0"/>
                 <w:sz w:val="18"/>
               </w:rPr>
-              <w:t>DatabaseIntegration.java</w:t>
+              <w:t>repository/MySqlDatabase.java</w:t>
             </w:r>
           </w:p>
         </w:tc>
@@ -1209,7 +1209,7 @@
                 <w:b w:val="0"/>
                 <w:sz w:val="18"/>
               </w:rPr>
-              <w:t>KisIntegration.java</w:t>
+              <w:t>external/KisQuotePoller.java</w:t>
             </w:r>
           </w:p>
         </w:tc>
@@ -1295,7 +1295,7 @@
                 <w:b w:val="0"/>
                 <w:sz w:val="18"/>
               </w:rPr>
-              <w:t>BrokerIntegration.java</w:t>
+              <w:t>external/MockBrokerServer.java</w:t>
             </w:r>
           </w:p>
         </w:tc>
@@ -1338,7 +1338,7 @@
                 <w:b w:val="0"/>
                 <w:sz w:val="18"/>
               </w:rPr>
-              <w:t>WebPages.java</w:t>
+              <w:t>view/MiniDashboardPage.java</w:t>
             </w:r>
           </w:p>
         </w:tc>
@@ -1381,7 +1381,7 @@
                 <w:b w:val="0"/>
                 <w:sz w:val="18"/>
               </w:rPr>
-              <w:t>Json.java</w:t>
+              <w:t>util/Json.java</w:t>
             </w:r>
           </w:p>
         </w:tc>
@@ -1428,17 +1428,21 @@
           <w:rFonts w:ascii="Consolas" w:hAnsi="Consolas"/>
           <w:sz w:val="17"/>
         </w:rPr>
-        <w:t>MiniProjectApp</w:t>
+        <w:t>src/main/java</w:t>
         <w:br/>
-        <w:t xml:space="preserve"> ├─ MiniHandler ── MiniProject ── Member / Stock / Share / TradeLog</w:t>
+        <w:t xml:space="preserve"> ├─ app/MiniProjectApp</w:t>
         <w:br/>
-        <w:t xml:space="preserve"> │                 ├─ MySqlDatabase</w:t>
+        <w:t xml:space="preserve"> ├─ controller/MiniHandler ── service/MiniProject</w:t>
         <w:br/>
-        <w:t xml:space="preserve"> │                 ├─ KisQuoteClient / KisQuotePoller ── KIS Open API</w:t>
+        <w:t xml:space="preserve"> │                            ├─ domain/Member, Stock, Share, TradeLog</w:t>
         <w:br/>
-        <w:t xml:space="preserve"> │                 └─ BrokerClient / BrokerServer ── TCP Socket</w:t>
+        <w:t xml:space="preserve"> │                            ├─ repository/MySqlDatabase, LocalFileDatabase</w:t>
         <w:br/>
-        <w:t xml:space="preserve"> └─ WebPages</w:t>
+        <w:t xml:space="preserve"> │                            └─ external/KisQuotePoller, MockBrokerServer</w:t>
+        <w:br/>
+        <w:t xml:space="preserve"> ├─ view/MiniDashboardPage</w:t>
+        <w:br/>
+        <w:t xml:space="preserve"> └─ util/Json</w:t>
       </w:r>
     </w:p>
     <w:p>
@@ -1454,7 +1458,7 @@
         <w:spacing w:after="120"/>
       </w:pPr>
       <w:r>
-        <w:t>프로젝트는 현재 과제 제출과 단일 javac 컴파일을 쉽게 하기 위해 루트 디렉터리 중심으로 구성했다. 다만 내부 역할은 서버, 핵심 서비스, 도메인 모델, 외부 시세, 저장소, 화면 생성으로 나누어 볼 수 있다. 발표에서는 아래 표를 기준으로 어떤 클래스가 어떤 Java 라이브러리를 사용했는지 설명하면 된다.</w:t>
+        <w:t>프로젝트는 src/main/java 아래에 app, controller, service, domain, repository, external, view, util 패키지로 분리했다. 발표에서는 아래 표를 기준으로 요청이 어떤 계층을 거쳐 처리되는지 설명하면 된다.</w:t>
       </w:r>
     </w:p>
     <w:tbl>
@@ -1597,7 +1601,7 @@
                 <w:b w:val="0"/>
                 <w:sz w:val="18"/>
               </w:rPr>
-              <w:t>MiniProjectApp, MiniHandler</w:t>
+              <w:t>app.MiniProjectApp, controller.MiniHandler</w:t>
             </w:r>
           </w:p>
         </w:tc>
@@ -2017,7 +2021,7 @@
                 <w:b w:val="0"/>
                 <w:sz w:val="18"/>
               </w:rPr>
-              <w:t>WebPages, Json</w:t>
+              <w:t>view.MiniDashboardPage, util.Json</w:t>
             </w:r>
           </w:p>
         </w:tc>
@@ -2153,7 +2157,7 @@
         <w:spacing w:after="120"/>
       </w:pPr>
       <w:r>
-        <w:t>나중에 유지보수를 더 쉽게 하려면 controller, service, domain, repository, security, ui 패키지로 물리적인 파일 위치까지 분리할 수 있다. 현재 보고서에서는 실제 코드가 루트 중심이라는 점과, 논리적으로는 위 계층으로 나뉜다는 점을 구분해서 설명한다.</w:t>
+        <w:t>src/main/java 패키지 구조로 옮겼기 때문에, 발표에서는 실제 파일 위치와 역할을 같이 설명할 수 있다. 다만 MiniProject가 아직 매매, 포트폴리오, 시장 상태를 함께 관리하므로 더 큰 프로젝트라면 service 계층을 더 세분화할 수 있다.</w:t>
       </w:r>
     </w:p>
     <w:p>
@@ -2213,7 +2217,7 @@
           <w:rFonts w:ascii="Consolas" w:hAnsi="Consolas"/>
           <w:sz w:val="17"/>
         </w:rPr>
-        <w:t>// KisIntegration.java - KIS 현재가 REST API 호출</w:t>
+        <w:t>// external/KisQuotePoller.java - KIS 현재가 REST API 호출</w:t>
         <w:br/>
         <w:t>HttpRequest request = HttpRequest.newBuilder(uri)</w:t>
         <w:br/>
@@ -2271,7 +2275,7 @@
           <w:rFonts w:ascii="Consolas" w:hAnsi="Consolas"/>
           <w:sz w:val="17"/>
         </w:rPr>
-        <w:t>// DatabaseIntegration.java - MySQL 트랜잭션 저장</w:t>
+        <w:t>// repository/MySqlDatabase.java - MySQL 트랜잭션 저장</w:t>
         <w:br/>
         <w:t>try (Connection con = DriverManager.getConnection(url, user, password)) {</w:t>
         <w:br/>
@@ -5216,7 +5220,7 @@
         <w:spacing w:after="120"/>
       </w:pPr>
       <w:r>
-        <w:t>프로젝트에는 REST API만 사용하는 구조에서 한 단계 더 나아가기 위해 모의 증권사 소켓 서버 구조와 KIS WebSocket 구독 시도 구조를 추가했다. BrokerIntegration은 ServerSocket과 클라이언트 구독 명령을 이용해 특정 종목의 가격 Tick을 전달하는 구조다. KisWebSocketQuoteClient는 승인키 발급, 국내주식 체결 구독 메시지 전송, 체결 메시지 파싱, BrokerTick 변환 흐름을 갖는다.</w:t>
+        <w:t>프로젝트에는 REST API만 사용하는 구조에서 한 단계 더 나아가기 위해 모의 증권사 소켓 서버 구조와 KIS WebSocket 구독 시도 구조를 추가했다. external 패키지의 MockBrokerServer와 BrokerFeedClient는 ServerSocket과 클라이언트 구독 명령을 이용해 특정 종목의 가격 Tick을 전달한다. KisWebSocketQuoteClient는 승인키 발급, 국내주식 체결 구독 메시지 전송, 체결 메시지 파싱, BrokerTick 변환 흐름을 갖는다.</w:t>
       </w:r>
     </w:p>
     <w:p>
@@ -6211,7 +6215,7 @@
         <w:spacing w:after="120"/>
       </w:pPr>
       <w:r>
-        <w:t>향후 개선한다면 실제 KIS 테스트베드에서 WebSocket 구독 성공 여부를 확인하고, controller, service, repository, model 패키지로 소스 구조를 분리하는 작업이 우선이다. 현재는 과제 제출과 컴파일 검증을 쉽게 하기 위해 루트 디렉터리 중심 구조를 유지했다. 이후에는 테스트 코드 추가, 회원 인증이 필요한 배포 버전, 업종별 위험 등급 UI 표시, 개인화 관심종목 추천 같은 기능을 확장할 수 있다.</w:t>
+        <w:t>향후 개선한다면 실제 KIS 테스트베드에서 WebSocket 구독 성공 여부를 확인하고, service 패키지 안의 MiniProject를 TradingService, PortfolioService, MarketService로 더 세분화할 수 있다. 이후에는 테스트 코드 추가, 회원 인증이 필요한 배포 버전, 업종별 위험 등급 UI 표시, 개인화 관심종목 추천 같은 기능을 확장할 수 있다.</w:t>
       </w:r>
     </w:p>
     <w:sectPr>

</xml_diff>

<commit_message>
Final submission consistency pass
</commit_message>
<xml_diff>
--- a/deliverables/Java_모의주식투자_개인프로젝트_보고서_최종정합본.docx
+++ b/deliverables/Java_모의주식투자_개인프로젝트_보고서_최종정합본.docx
@@ -438,7 +438,7 @@
         <w:spacing w:after="120"/>
       </w:pPr>
       <w:r>
-        <w:t>초기 제안 단계에서는 기본 Java 기능을 웹 화면으로 옮기고 회원, 매매 기능을 구현하는 방향이었다. 진행 중 모의주식투자라는 주제에는 내부 샘플 가격보다 실제 주식 시세와 거래량이 더 적합하다고 판단했다.</w:t>
+        <w:t>초기 제안 단계에서는 기본 Java 기능을 웹 화면으로 옮기고 계좌, 매매 기능을 구현하는 방향이었다. 진행 중 모의주식투자라는 주제에는 내부 샘플 가격보다 실제 주식 시세와 거래량이 더 적합하다고 판단했다.</w:t>
       </w:r>
     </w:p>
     <w:tbl>
@@ -2165,7 +2165,7 @@
         <w:pStyle w:val="Heading2"/>
       </w:pPr>
       <w:r>
-        <w:t>3.3 주요 코드 일부</w:t>
+        <w:t>3.3 주요 코드 흐름</w:t>
       </w:r>
     </w:p>
     <w:p>
@@ -3291,7 +3291,7 @@
                 <w:b w:val="0"/>
                 <w:sz w:val="18"/>
               </w:rPr>
-              <w:t>모의 계좌, 보유 주식, 거래 기록을 MySQL에 저장</w:t>
+              <w:t>모의 계좌 정보, 보유 주식, 거래 기록을 MySQL에 저장</w:t>
             </w:r>
           </w:p>
         </w:tc>
@@ -3693,7 +3693,7 @@
                 <w:b w:val="0"/>
                 <w:sz w:val="18"/>
               </w:rPr>
-              <w:t>메모리 기반 구조에서는 서버를 재시작하면 회원, 보유 주식, 거래 기록이 사라졌다. 이를 해결하기 위해 MySQL 테이블 구조를 설계하고 거래 기록과 보유 종목을 저장하는 방식으로 바꿨다.</w:t>
+              <w:t>메모리 기반 구조에서는 서버를 재시작하면 모의 계좌, 보유 주식, 거래 기록이 사라졌다. 이를 해결하기 위해 MySQL 테이블 구조를 설계하고 거래 기록과 보유 종목을 저장하는 방식으로 바꿨다.</w:t>
             </w:r>
           </w:p>
         </w:tc>
@@ -3932,7 +3932,7 @@
                 <w:b w:val="0"/>
                 <w:sz w:val="18"/>
               </w:rPr>
-              <w:t>회원, 종목, 보유 주식 상태 동시 접근 처리</w:t>
+              <w:t>모의 계좌, 종목, 보유 주식 상태 동시 접근 처리</w:t>
             </w:r>
           </w:p>
         </w:tc>
@@ -4083,7 +4083,7 @@
                 <w:b w:val="0"/>
                 <w:sz w:val="18"/>
               </w:rPr>
-              <w:t>Files / Path</w:t>
+              <w:t>LocalDateTime</w:t>
             </w:r>
           </w:p>
         </w:tc>
@@ -4091,48 +4091,6 @@
           <w:tcPr>
             <w:tcW w:type="dxa" w:w="7200"/>
             <w:shd w:fill="F6F9FD"/>
-            <w:vAlign w:val="center"/>
-          </w:tcPr>
-          <w:p>
-            <w:pPr>
-              <w:spacing w:after="0"/>
-            </w:pPr>
-            <w:r/>
-            <w:r>
-              <w:rPr>
-                <w:rFonts w:ascii="맑은 고딕" w:hAnsi="맑은 고딕" w:eastAsia="맑은 고딕"/>
-                <w:b w:val="0"/>
-                <w:sz w:val="18"/>
-              </w:rPr>
-              <w:t>초기 설정, 스크립트, 문서 산출물 관리</w:t>
-            </w:r>
-          </w:p>
-        </w:tc>
-      </w:tr>
-      <w:tr>
-        <w:tc>
-          <w:tcPr>
-            <w:tcW w:type="dxa" w:w="3168"/>
-            <w:vAlign w:val="center"/>
-          </w:tcPr>
-          <w:p>
-            <w:pPr>
-              <w:spacing w:after="0"/>
-            </w:pPr>
-            <w:r/>
-            <w:r>
-              <w:rPr>
-                <w:rFonts w:ascii="맑은 고딕" w:hAnsi="맑은 고딕" w:eastAsia="맑은 고딕"/>
-                <w:b w:val="0"/>
-                <w:sz w:val="18"/>
-              </w:rPr>
-              <w:t>LocalDateTime</w:t>
-            </w:r>
-          </w:p>
-        </w:tc>
-        <w:tc>
-          <w:tcPr>
-            <w:tcW w:type="dxa" w:w="7200"/>
             <w:vAlign w:val="center"/>
           </w:tcPr>
           <w:p>
@@ -4155,7 +4113,6 @@
         <w:tc>
           <w:tcPr>
             <w:tcW w:type="dxa" w:w="3168"/>
-            <w:shd w:fill="F6F9FD"/>
             <w:vAlign w:val="center"/>
           </w:tcPr>
           <w:p>
@@ -4169,14 +4126,13 @@
                 <w:b w:val="0"/>
                 <w:sz w:val="18"/>
               </w:rPr>
-              <w:t>AtomicLong / AtomicInteger</w:t>
+              <w:t>AtomicLong</w:t>
             </w:r>
           </w:p>
         </w:tc>
         <w:tc>
           <w:tcPr>
             <w:tcW w:type="dxa" w:w="7200"/>
-            <w:shd w:fill="F6F9FD"/>
             <w:vAlign w:val="center"/>
           </w:tcPr>
           <w:p>
@@ -4190,7 +4146,7 @@
                 <w:b w:val="0"/>
                 <w:sz w:val="18"/>
               </w:rPr>
-              <w:t>회원 번호, 로그 번호 등 식별자 생성</w:t>
+              <w:t>모의 계좌 번호와 시세 Tick 카운트 관리</w:t>
             </w:r>
           </w:p>
         </w:tc>

</xml_diff>

<commit_message>
Fix final presentation consistency
</commit_message>
<xml_diff>
--- a/deliverables/Java_모의주식투자_개인프로젝트_보고서_최종정합본.docx
+++ b/deliverables/Java_모의주식투자_개인프로젝트_보고서_최종정합본.docx
@@ -5731,7 +5731,7 @@
                 <w:b w:val="0"/>
                 <w:sz w:val="18"/>
               </w:rPr>
-              <w:t>매수/매도 기록을 저장소에 저장</w:t>
+              <w:t>매수/매도 기록을 MySQL에 저장</w:t>
             </w:r>
           </w:p>
         </w:tc>
@@ -5751,7 +5751,7 @@
         <w:spacing w:after="120"/>
       </w:pPr>
       <w:r>
-        <w:t>시연 영상은 실제 코드 설명보다 사용자가 보는 화면 흐름을 보여주는 용도이다. 이번 제출용 영상은 약 16초 길이로 접속, 종목 선택, 가격 그래프 확인, 매수, 보유 종목 손익 확인 장면이 들어 있다.</w:t>
+        <w:t>시연 영상은 실제 코드 설명보다 사용자가 보는 화면 흐름을 보여주는 용도이다. 이번 제출용 영상은 약 31초 길이로 접속, 종목 선택, 가격 그래프 확인, 매수, 보유 종목 손익 확인 장면이 들어 있다.</w:t>
       </w:r>
     </w:p>
     <w:tbl>
@@ -5851,7 +5851,7 @@
                 <w:b w:val="0"/>
                 <w:sz w:val="18"/>
               </w:rPr>
-              <w:t>0~5초</w:t>
+              <w:t>0~7초</w:t>
             </w:r>
           </w:p>
         </w:tc>
@@ -5914,7 +5914,7 @@
                 <w:b w:val="0"/>
                 <w:sz w:val="18"/>
               </w:rPr>
-              <w:t>5~9초</w:t>
+              <w:t>7~14초</w:t>
             </w:r>
           </w:p>
         </w:tc>
@@ -5978,7 +5978,7 @@
                 <w:b w:val="0"/>
                 <w:sz w:val="18"/>
               </w:rPr>
-              <w:t>9~12초</w:t>
+              <w:t>14~23초</w:t>
             </w:r>
           </w:p>
         </w:tc>
@@ -6041,7 +6041,7 @@
                 <w:b w:val="0"/>
                 <w:sz w:val="18"/>
               </w:rPr>
-              <w:t>12~16초</w:t>
+              <w:t>23~31초</w:t>
             </w:r>
           </w:p>
         </w:tc>

</xml_diff>

<commit_message>
Refine presentation and demo video
</commit_message>
<xml_diff>
--- a/deliverables/Java_모의주식투자_개인프로젝트_보고서_최종정합본.docx
+++ b/deliverables/Java_모의주식투자_개인프로젝트_보고서_최종정합본.docx
@@ -3421,6 +3421,57 @@
     </w:p>
     <w:p>
       <w:pPr>
+        <w:jc w:val="center"/>
+      </w:pPr>
+      <w:r>
+        <w:drawing>
+          <wp:inline xmlns:a="http://schemas.openxmlformats.org/drawingml/2006/main" xmlns:pic="http://schemas.openxmlformats.org/drawingml/2006/picture">
+            <wp:extent cx="5852160" cy="3292644"/>
+            <wp:docPr id="1" name="Picture 1"/>
+            <wp:cNvGraphicFramePr>
+              <a:graphicFrameLocks noChangeAspect="1"/>
+            </wp:cNvGraphicFramePr>
+            <a:graphic>
+              <a:graphicData uri="http://schemas.openxmlformats.org/drawingml/2006/picture">
+                <pic:pic>
+                  <pic:nvPicPr>
+                    <pic:cNvPr id="0" name="mock-stock-website-demo-preview.png"/>
+                    <pic:cNvPicPr/>
+                  </pic:nvPicPr>
+                  <pic:blipFill>
+                    <a:blip r:embed="rId9"/>
+                    <a:stretch>
+                      <a:fillRect/>
+                    </a:stretch>
+                  </pic:blipFill>
+                  <pic:spPr>
+                    <a:xfrm>
+                      <a:off x="0" y="0"/>
+                      <a:ext cx="5852160" cy="3292644"/>
+                    </a:xfrm>
+                    <a:prstGeom prst="rect"/>
+                  </pic:spPr>
+                </pic:pic>
+              </a:graphicData>
+            </a:graphic>
+          </wp:inline>
+        </w:drawing>
+      </w:r>
+    </w:p>
+    <w:p>
+      <w:pPr>
+        <w:jc w:val="center"/>
+      </w:pPr>
+      <w:r>
+        <w:rPr>
+          <w:color w:val="667085"/>
+          <w:sz w:val="17"/>
+        </w:rPr>
+        <w:t>시연 영상 미리보기: 종목 상세, 매수 완료 메시지, 가격 그래프, 보유 종목 손익 화면</w:t>
+      </w:r>
+    </w:p>
+    <w:p>
+      <w:pPr>
         <w:pStyle w:val="Heading1"/>
       </w:pPr>
       <w:r>
@@ -5751,7 +5802,7 @@
         <w:spacing w:after="120"/>
       </w:pPr>
       <w:r>
-        <w:t>시연 영상은 실제 코드 설명보다 사용자가 보는 화면 흐름을 보여주는 용도이다. 이번 제출용 영상은 약 31초 길이로 접속, 종목 선택, 가격 그래프 확인, 매수, 보유 종목 손익 확인 장면이 들어 있다.</w:t>
+        <w:t>시연 영상은 실제 코드 설명보다 사용자가 보는 화면 흐름을 보여주는 용도이다. 이번 제출용 영상은 약 44초 길이로 접속, 종목코드 검색, 가격 그래프 확인, 매수, 보유 종목 손익 확인 장면이 들어 있다.</w:t>
       </w:r>
     </w:p>
     <w:tbl>
@@ -5851,7 +5902,7 @@
                 <w:b w:val="0"/>
                 <w:sz w:val="18"/>
               </w:rPr>
-              <w:t>0~7초</w:t>
+              <w:t>0~8초</w:t>
             </w:r>
           </w:p>
         </w:tc>
@@ -5914,7 +5965,7 @@
                 <w:b w:val="0"/>
                 <w:sz w:val="18"/>
               </w:rPr>
-              <w:t>7~14초</w:t>
+              <w:t>8~17초</w:t>
             </w:r>
           </w:p>
         </w:tc>
@@ -5935,7 +5986,7 @@
                 <w:b w:val="0"/>
                 <w:sz w:val="18"/>
               </w:rPr>
-              <w:t>종목 검색과 상세 화면</w:t>
+              <w:t>종목코드 검색</w:t>
             </w:r>
           </w:p>
         </w:tc>
@@ -5956,7 +6007,7 @@
                 <w:b w:val="0"/>
                 <w:sz w:val="18"/>
               </w:rPr>
-              <w:t>종목 클릭 중심의 매매 흐름</w:t>
+              <w:t>009150을 입력해 삼성전기 종목을 조회</w:t>
             </w:r>
           </w:p>
         </w:tc>
@@ -5978,7 +6029,7 @@
                 <w:b w:val="0"/>
                 <w:sz w:val="18"/>
               </w:rPr>
-              <w:t>14~23초</w:t>
+              <w:t>17~30초</w:t>
             </w:r>
           </w:p>
         </w:tc>
@@ -6041,7 +6092,7 @@
                 <w:b w:val="0"/>
                 <w:sz w:val="18"/>
               </w:rPr>
-              <w:t>23~31초</w:t>
+              <w:t>30~44초</w:t>
             </w:r>
           </w:p>
         </w:tc>

</xml_diff>

<commit_message>
Add actual UI screenshots to deliverables
</commit_message>
<xml_diff>
--- a/deliverables/Java_모의주식투자_개인프로젝트_보고서_최종정합본.docx
+++ b/deliverables/Java_모의주식투자_개인프로젝트_보고서_최종정합본.docx
@@ -3426,7 +3426,7 @@
       <w:r>
         <w:drawing>
           <wp:inline xmlns:a="http://schemas.openxmlformats.org/drawingml/2006/main" xmlns:pic="http://schemas.openxmlformats.org/drawingml/2006/picture">
-            <wp:extent cx="5852160" cy="3292644"/>
+            <wp:extent cx="3108960" cy="5077180"/>
             <wp:docPr id="1" name="Picture 1"/>
             <wp:cNvGraphicFramePr>
               <a:graphicFrameLocks noChangeAspect="1"/>
@@ -3435,7 +3435,7 @@
               <a:graphicData uri="http://schemas.openxmlformats.org/drawingml/2006/picture">
                 <pic:pic>
                   <pic:nvPicPr>
-                    <pic:cNvPr id="0" name="mock-stock-website-demo-preview.png"/>
+                    <pic:cNvPr id="0" name="ui-crop-01-market.png"/>
                     <pic:cNvPicPr/>
                   </pic:nvPicPr>
                   <pic:blipFill>
@@ -3447,7 +3447,7 @@
                   <pic:spPr>
                     <a:xfrm>
                       <a:off x="0" y="0"/>
-                      <a:ext cx="5852160" cy="3292644"/>
+                      <a:ext cx="3108960" cy="5077180"/>
                     </a:xfrm>
                     <a:prstGeom prst="rect"/>
                   </pic:spPr>
@@ -3467,7 +3467,109 @@
           <w:color w:val="667085"/>
           <w:sz w:val="17"/>
         </w:rPr>
-        <w:t>시연 영상 미리보기: 종목 상세, 매수 완료 메시지, 가격 그래프, 보유 종목 손익 화면</w:t>
+        <w:t>화면 1. 시장 시세: 거래량 상위 종목, 검색창, 즐겨찾기, 페이지 이동</w:t>
+      </w:r>
+    </w:p>
+    <w:p>
+      <w:pPr>
+        <w:jc w:val="center"/>
+      </w:pPr>
+      <w:r>
+        <w:drawing>
+          <wp:inline xmlns:a="http://schemas.openxmlformats.org/drawingml/2006/main" xmlns:pic="http://schemas.openxmlformats.org/drawingml/2006/picture">
+            <wp:extent cx="5852160" cy="3978279"/>
+            <wp:docPr id="2" name="Picture 2"/>
+            <wp:cNvGraphicFramePr>
+              <a:graphicFrameLocks noChangeAspect="1"/>
+            </wp:cNvGraphicFramePr>
+            <a:graphic>
+              <a:graphicData uri="http://schemas.openxmlformats.org/drawingml/2006/picture">
+                <pic:pic>
+                  <pic:nvPicPr>
+                    <pic:cNvPr id="0" name="ui-crop-02-detail-order.png"/>
+                    <pic:cNvPicPr/>
+                  </pic:nvPicPr>
+                  <pic:blipFill>
+                    <a:blip r:embed="rId10"/>
+                    <a:stretch>
+                      <a:fillRect/>
+                    </a:stretch>
+                  </pic:blipFill>
+                  <pic:spPr>
+                    <a:xfrm>
+                      <a:off x="0" y="0"/>
+                      <a:ext cx="5852160" cy="3978279"/>
+                    </a:xfrm>
+                    <a:prstGeom prst="rect"/>
+                  </pic:spPr>
+                </pic:pic>
+              </a:graphicData>
+            </a:graphic>
+          </wp:inline>
+        </w:drawing>
+      </w:r>
+    </w:p>
+    <w:p>
+      <w:pPr>
+        <w:jc w:val="center"/>
+      </w:pPr>
+      <w:r>
+        <w:rPr>
+          <w:color w:val="667085"/>
+          <w:sz w:val="17"/>
+        </w:rPr>
+        <w:t>화면 2. 종목 상세: 현재가, 등락률, 거래량, 회사 설명, 매수/매도 입력</w:t>
+      </w:r>
+    </w:p>
+    <w:p>
+      <w:pPr>
+        <w:jc w:val="center"/>
+      </w:pPr>
+      <w:r>
+        <w:drawing>
+          <wp:inline xmlns:a="http://schemas.openxmlformats.org/drawingml/2006/main" xmlns:pic="http://schemas.openxmlformats.org/drawingml/2006/picture">
+            <wp:extent cx="5852160" cy="664918"/>
+            <wp:docPr id="3" name="Picture 3"/>
+            <wp:cNvGraphicFramePr>
+              <a:graphicFrameLocks noChangeAspect="1"/>
+            </wp:cNvGraphicFramePr>
+            <a:graphic>
+              <a:graphicData uri="http://schemas.openxmlformats.org/drawingml/2006/picture">
+                <pic:pic>
+                  <pic:nvPicPr>
+                    <pic:cNvPr id="0" name="ui-crop-03-portfolio.png"/>
+                    <pic:cNvPicPr/>
+                  </pic:nvPicPr>
+                  <pic:blipFill>
+                    <a:blip r:embed="rId11"/>
+                    <a:stretch>
+                      <a:fillRect/>
+                    </a:stretch>
+                  </pic:blipFill>
+                  <pic:spPr>
+                    <a:xfrm>
+                      <a:off x="0" y="0"/>
+                      <a:ext cx="5852160" cy="664918"/>
+                    </a:xfrm>
+                    <a:prstGeom prst="rect"/>
+                  </pic:spPr>
+                </pic:pic>
+              </a:graphicData>
+            </a:graphic>
+          </wp:inline>
+        </w:drawing>
+      </w:r>
+    </w:p>
+    <w:p>
+      <w:pPr>
+        <w:jc w:val="center"/>
+      </w:pPr>
+      <w:r>
+        <w:rPr>
+          <w:color w:val="667085"/>
+          <w:sz w:val="17"/>
+        </w:rPr>
+        <w:t>화면 3. 보유 탭: 보유 수량, 평가금액, 손익, 수익률, 매도 입력</w:t>
       </w:r>
     </w:p>
     <w:p>

</xml_diff>

<commit_message>
Expand final presentation explanation
</commit_message>
<xml_diff>
--- a/deliverables/Java_모의주식투자_개인프로젝트_보고서_최종정합본.docx
+++ b/deliverables/Java_모의주식투자_개인프로젝트_보고서_최종정합본.docx
@@ -425,6 +425,420 @@
         <w:t>다수 클래스/인터페이스 구조와 실제 실행 가능한 웹 UI 구현</w:t>
       </w:r>
     </w:p>
+    <w:p>
+      <w:pPr>
+        <w:pStyle w:val="Heading2"/>
+      </w:pPr>
+      <w:r>
+        <w:t>1.1 한눈에 보는 핵심 구현</w:t>
+      </w:r>
+    </w:p>
+    <w:p>
+      <w:pPr>
+        <w:spacing w:after="120"/>
+      </w:pPr>
+      <w:r>
+        <w:t>교수님이 프로젝트를 처음 볼 때 가장 먼저 이해해야 하는 부분은 사용자의 화면 조작이 Java 서버, 외부 시세 API, MySQL 저장소로 어떻게 이어지는지이다. 이 프로젝트는 프론트엔드 프레임워크 없이 Java 서버가 HTML/CSS/JavaScript 화면을 직접 내려주고, 브라우저는 필요한 순간 API를 호출해 상태를 다시 받아오는 구조다.</w:t>
+      </w:r>
+    </w:p>
+    <w:tbl>
+      <w:tblPr>
+        <w:tblStyle w:val="TableGrid"/>
+        <w:tblW w:type="auto" w:w="0"/>
+        <w:jc w:val="center"/>
+        <w:tblLook w:firstColumn="1" w:firstRow="1" w:lastColumn="0" w:lastRow="0" w:noHBand="0" w:noVBand="1" w:val="04A0"/>
+      </w:tblPr>
+      <w:tblGrid>
+        <w:gridCol w:w="3264"/>
+        <w:gridCol w:w="3264"/>
+        <w:gridCol w:w="3264"/>
+      </w:tblGrid>
+      <w:tr>
+        <w:tc>
+          <w:tcPr>
+            <w:tcW w:type="dxa" w:w="2016"/>
+            <w:shd w:fill="122033"/>
+            <w:vAlign w:val="center"/>
+          </w:tcPr>
+          <w:p>
+            <w:pPr>
+              <w:spacing w:after="0"/>
+            </w:pPr>
+            <w:r/>
+            <w:r>
+              <w:rPr>
+                <w:rFonts w:ascii="맑은 고딕" w:hAnsi="맑은 고딕" w:eastAsia="맑은 고딕"/>
+                <w:b/>
+                <w:color w:val="FFFFFF"/>
+                <w:sz w:val="18"/>
+              </w:rPr>
+              <w:t>구분</w:t>
+            </w:r>
+          </w:p>
+        </w:tc>
+        <w:tc>
+          <w:tcPr>
+            <w:tcW w:type="dxa" w:w="4464"/>
+            <w:shd w:fill="122033"/>
+            <w:vAlign w:val="center"/>
+          </w:tcPr>
+          <w:p>
+            <w:pPr>
+              <w:spacing w:after="0"/>
+            </w:pPr>
+            <w:r/>
+            <w:r>
+              <w:rPr>
+                <w:rFonts w:ascii="맑은 고딕" w:hAnsi="맑은 고딕" w:eastAsia="맑은 고딕"/>
+                <w:b/>
+                <w:color w:val="FFFFFF"/>
+                <w:sz w:val="18"/>
+              </w:rPr>
+              <w:t>구현 내용</w:t>
+            </w:r>
+          </w:p>
+        </w:tc>
+        <w:tc>
+          <w:tcPr>
+            <w:tcW w:type="dxa" w:w="4176"/>
+            <w:shd w:fill="122033"/>
+            <w:vAlign w:val="center"/>
+          </w:tcPr>
+          <w:p>
+            <w:pPr>
+              <w:spacing w:after="0"/>
+            </w:pPr>
+            <w:r/>
+            <w:r>
+              <w:rPr>
+                <w:rFonts w:ascii="맑은 고딕" w:hAnsi="맑은 고딕" w:eastAsia="맑은 고딕"/>
+                <w:b/>
+                <w:color w:val="FFFFFF"/>
+                <w:sz w:val="18"/>
+              </w:rPr>
+              <w:t>발표에서 강조할 점</w:t>
+            </w:r>
+          </w:p>
+        </w:tc>
+      </w:tr>
+      <w:tr>
+        <w:tc>
+          <w:tcPr>
+            <w:tcW w:type="dxa" w:w="2016"/>
+            <w:vAlign w:val="center"/>
+          </w:tcPr>
+          <w:p>
+            <w:pPr>
+              <w:spacing w:after="0"/>
+            </w:pPr>
+            <w:r/>
+            <w:r>
+              <w:rPr>
+                <w:rFonts w:ascii="맑은 고딕" w:hAnsi="맑은 고딕" w:eastAsia="맑은 고딕"/>
+                <w:b w:val="0"/>
+                <w:sz w:val="18"/>
+              </w:rPr>
+              <w:t>사용자 화면</w:t>
+            </w:r>
+          </w:p>
+        </w:tc>
+        <w:tc>
+          <w:tcPr>
+            <w:tcW w:type="dxa" w:w="4464"/>
+            <w:vAlign w:val="center"/>
+          </w:tcPr>
+          <w:p>
+            <w:pPr>
+              <w:spacing w:after="0"/>
+            </w:pPr>
+            <w:r/>
+            <w:r>
+              <w:rPr>
+                <w:rFonts w:ascii="맑은 고딕" w:hAnsi="맑은 고딕" w:eastAsia="맑은 고딕"/>
+                <w:b w:val="0"/>
+                <w:sz w:val="18"/>
+              </w:rPr>
+              <w:t>시장 시세, 검색, 즐겨찾기, 종목 상세, 매수/매도, 보유 탭</w:t>
+            </w:r>
+          </w:p>
+        </w:tc>
+        <w:tc>
+          <w:tcPr>
+            <w:tcW w:type="dxa" w:w="4176"/>
+            <w:vAlign w:val="center"/>
+          </w:tcPr>
+          <w:p>
+            <w:pPr>
+              <w:spacing w:after="0"/>
+            </w:pPr>
+            <w:r/>
+            <w:r>
+              <w:rPr>
+                <w:rFonts w:ascii="맑은 고딕" w:hAnsi="맑은 고딕" w:eastAsia="맑은 고딕"/>
+                <w:b w:val="0"/>
+                <w:sz w:val="18"/>
+              </w:rPr>
+              <w:t>사용자가 실제 투자 앱처럼 종목을 보고 판단한 뒤 주문한다.</w:t>
+            </w:r>
+          </w:p>
+        </w:tc>
+      </w:tr>
+      <w:tr>
+        <w:tc>
+          <w:tcPr>
+            <w:tcW w:type="dxa" w:w="2016"/>
+            <w:shd w:fill="F6F9FD"/>
+            <w:vAlign w:val="center"/>
+          </w:tcPr>
+          <w:p>
+            <w:pPr>
+              <w:spacing w:after="0"/>
+            </w:pPr>
+            <w:r/>
+            <w:r>
+              <w:rPr>
+                <w:rFonts w:ascii="맑은 고딕" w:hAnsi="맑은 고딕" w:eastAsia="맑은 고딕"/>
+                <w:b w:val="0"/>
+                <w:sz w:val="18"/>
+              </w:rPr>
+              <w:t>외부 시세</w:t>
+            </w:r>
+          </w:p>
+        </w:tc>
+        <w:tc>
+          <w:tcPr>
+            <w:tcW w:type="dxa" w:w="4464"/>
+            <w:shd w:fill="F6F9FD"/>
+            <w:vAlign w:val="center"/>
+          </w:tcPr>
+          <w:p>
+            <w:pPr>
+              <w:spacing w:after="0"/>
+            </w:pPr>
+            <w:r/>
+            <w:r>
+              <w:rPr>
+                <w:rFonts w:ascii="맑은 고딕" w:hAnsi="맑은 고딕" w:eastAsia="맑은 고딕"/>
+                <w:b w:val="0"/>
+                <w:sz w:val="18"/>
+              </w:rPr>
+              <w:t>KIS Open API 현재가와 거래량 조회</w:t>
+            </w:r>
+          </w:p>
+        </w:tc>
+        <w:tc>
+          <w:tcPr>
+            <w:tcW w:type="dxa" w:w="4176"/>
+            <w:shd w:fill="F6F9FD"/>
+            <w:vAlign w:val="center"/>
+          </w:tcPr>
+          <w:p>
+            <w:pPr>
+              <w:spacing w:after="0"/>
+            </w:pPr>
+            <w:r/>
+            <w:r>
+              <w:rPr>
+                <w:rFonts w:ascii="맑은 고딕" w:hAnsi="맑은 고딕" w:eastAsia="맑은 고딕"/>
+                <w:b w:val="0"/>
+                <w:sz w:val="18"/>
+              </w:rPr>
+              <w:t>더미 데이터가 아니라 외부 시세 연동을 시도한 프로젝트다.</w:t>
+            </w:r>
+          </w:p>
+        </w:tc>
+      </w:tr>
+      <w:tr>
+        <w:tc>
+          <w:tcPr>
+            <w:tcW w:type="dxa" w:w="2016"/>
+            <w:vAlign w:val="center"/>
+          </w:tcPr>
+          <w:p>
+            <w:pPr>
+              <w:spacing w:after="0"/>
+            </w:pPr>
+            <w:r/>
+            <w:r>
+              <w:rPr>
+                <w:rFonts w:ascii="맑은 고딕" w:hAnsi="맑은 고딕" w:eastAsia="맑은 고딕"/>
+                <w:b w:val="0"/>
+                <w:sz w:val="18"/>
+              </w:rPr>
+              <w:t>서버 로직</w:t>
+            </w:r>
+          </w:p>
+        </w:tc>
+        <w:tc>
+          <w:tcPr>
+            <w:tcW w:type="dxa" w:w="4464"/>
+            <w:vAlign w:val="center"/>
+          </w:tcPr>
+          <w:p>
+            <w:pPr>
+              <w:spacing w:after="0"/>
+            </w:pPr>
+            <w:r/>
+            <w:r>
+              <w:rPr>
+                <w:rFonts w:ascii="맑은 고딕" w:hAnsi="맑은 고딕" w:eastAsia="맑은 고딕"/>
+                <w:b w:val="0"/>
+                <w:sz w:val="18"/>
+              </w:rPr>
+              <w:t>MiniHandler가 요청을 받고 MiniProject가 매매와 손익을 계산</w:t>
+            </w:r>
+          </w:p>
+        </w:tc>
+        <w:tc>
+          <w:tcPr>
+            <w:tcW w:type="dxa" w:w="4176"/>
+            <w:vAlign w:val="center"/>
+          </w:tcPr>
+          <w:p>
+            <w:pPr>
+              <w:spacing w:after="0"/>
+            </w:pPr>
+            <w:r/>
+            <w:r>
+              <w:rPr>
+                <w:rFonts w:ascii="맑은 고딕" w:hAnsi="맑은 고딕" w:eastAsia="맑은 고딕"/>
+                <w:b w:val="0"/>
+                <w:sz w:val="18"/>
+              </w:rPr>
+              <w:t>Java 표준 HttpServer 기반으로 직접 요청 흐름을 구현했다.</w:t>
+            </w:r>
+          </w:p>
+        </w:tc>
+      </w:tr>
+      <w:tr>
+        <w:tc>
+          <w:tcPr>
+            <w:tcW w:type="dxa" w:w="2016"/>
+            <w:shd w:fill="F6F9FD"/>
+            <w:vAlign w:val="center"/>
+          </w:tcPr>
+          <w:p>
+            <w:pPr>
+              <w:spacing w:after="0"/>
+            </w:pPr>
+            <w:r/>
+            <w:r>
+              <w:rPr>
+                <w:rFonts w:ascii="맑은 고딕" w:hAnsi="맑은 고딕" w:eastAsia="맑은 고딕"/>
+                <w:b w:val="0"/>
+                <w:sz w:val="18"/>
+              </w:rPr>
+              <w:t>저장 구조</w:t>
+            </w:r>
+          </w:p>
+        </w:tc>
+        <w:tc>
+          <w:tcPr>
+            <w:tcW w:type="dxa" w:w="4464"/>
+            <w:shd w:fill="F6F9FD"/>
+            <w:vAlign w:val="center"/>
+          </w:tcPr>
+          <w:p>
+            <w:pPr>
+              <w:spacing w:after="0"/>
+            </w:pPr>
+            <w:r/>
+            <w:r>
+              <w:rPr>
+                <w:rFonts w:ascii="맑은 고딕" w:hAnsi="맑은 고딕" w:eastAsia="맑은 고딕"/>
+                <w:b w:val="0"/>
+                <w:sz w:val="18"/>
+              </w:rPr>
+              <w:t>MySQL members, shares, trade_logs</w:t>
+            </w:r>
+          </w:p>
+        </w:tc>
+        <w:tc>
+          <w:tcPr>
+            <w:tcW w:type="dxa" w:w="4176"/>
+            <w:shd w:fill="F6F9FD"/>
+            <w:vAlign w:val="center"/>
+          </w:tcPr>
+          <w:p>
+            <w:pPr>
+              <w:spacing w:after="0"/>
+            </w:pPr>
+            <w:r/>
+            <w:r>
+              <w:rPr>
+                <w:rFonts w:ascii="맑은 고딕" w:hAnsi="맑은 고딕" w:eastAsia="맑은 고딕"/>
+                <w:b w:val="0"/>
+                <w:sz w:val="18"/>
+              </w:rPr>
+              <w:t>서버를 껐다 켜도 계좌와 거래 기록을 유지한다.</w:t>
+            </w:r>
+          </w:p>
+        </w:tc>
+      </w:tr>
+      <w:tr>
+        <w:tc>
+          <w:tcPr>
+            <w:tcW w:type="dxa" w:w="2016"/>
+            <w:vAlign w:val="center"/>
+          </w:tcPr>
+          <w:p>
+            <w:pPr>
+              <w:spacing w:after="0"/>
+            </w:pPr>
+            <w:r/>
+            <w:r>
+              <w:rPr>
+                <w:rFonts w:ascii="맑은 고딕" w:hAnsi="맑은 고딕" w:eastAsia="맑은 고딕"/>
+                <w:b w:val="0"/>
+                <w:sz w:val="18"/>
+              </w:rPr>
+              <w:t>실시간성</w:t>
+            </w:r>
+          </w:p>
+        </w:tc>
+        <w:tc>
+          <w:tcPr>
+            <w:tcW w:type="dxa" w:w="4464"/>
+            <w:vAlign w:val="center"/>
+          </w:tcPr>
+          <w:p>
+            <w:pPr>
+              <w:spacing w:after="0"/>
+            </w:pPr>
+            <w:r/>
+            <w:r>
+              <w:rPr>
+                <w:rFonts w:ascii="맑은 고딕" w:hAnsi="맑은 고딕" w:eastAsia="맑은 고딕"/>
+                <w:b w:val="0"/>
+                <w:sz w:val="18"/>
+              </w:rPr>
+              <w:t>Thread 기반 갱신과 WebSocket 구독 구조 실험</w:t>
+            </w:r>
+          </w:p>
+        </w:tc>
+        <w:tc>
+          <w:tcPr>
+            <w:tcW w:type="dxa" w:w="4176"/>
+            <w:vAlign w:val="center"/>
+          </w:tcPr>
+          <w:p>
+            <w:pPr>
+              <w:spacing w:after="0"/>
+            </w:pPr>
+            <w:r/>
+            <w:r>
+              <w:rPr>
+                <w:rFonts w:ascii="맑은 고딕" w:hAnsi="맑은 고딕" w:eastAsia="맑은 고딕"/>
+                <w:b w:val="0"/>
+                <w:sz w:val="18"/>
+              </w:rPr>
+              <w:t>개인 PC에서 가능한 범위 안에서 실시간성을 설계했다.</w:t>
+            </w:r>
+          </w:p>
+        </w:tc>
+      </w:tr>
+    </w:tbl>
+    <w:p/>
     <w:p>
       <w:pPr>
         <w:pStyle w:val="Heading1"/>
@@ -2176,6 +2590,412 @@
         <w:t>아래 코드는 발표 때 보여주기 위한 핵심 부분만 줄인 것이다. 전체 코드를 모두 설명하기보다 HTTP 요청이 들어오고, 외부 시세를 조회하고, 매수 결과를 저장하는 흐름을 중심으로 정리했다.</w:t>
       </w:r>
     </w:p>
+    <w:p>
+      <w:pPr>
+        <w:spacing w:after="120"/>
+      </w:pPr>
+      <w:r>
+        <w:t>예를 들어 사용자가 삼성전기 상세 화면에서 매수 버튼을 누르면 브라우저는 /api/stock/buy로 종목명과 수량을 보낸다. MiniHandler는 이 요청을 MiniProject.buyStock()으로 넘기고, MiniProject는 잔액과 수량을 확인한 뒤 보유 종목과 거래 기록을 갱신한다. 마지막으로 MySqlDatabase가 변경된 계좌, 보유 주식, 거래 기록을 MySQL에 저장한다.</w:t>
+      </w:r>
+    </w:p>
+    <w:tbl>
+      <w:tblPr>
+        <w:tblStyle w:val="TableGrid"/>
+        <w:tblW w:type="auto" w:w="0"/>
+        <w:jc w:val="center"/>
+        <w:tblLook w:firstColumn="1" w:firstRow="1" w:lastColumn="0" w:lastRow="0" w:noHBand="0" w:noVBand="1" w:val="04A0"/>
+      </w:tblPr>
+      <w:tblGrid>
+        <w:gridCol w:w="3264"/>
+        <w:gridCol w:w="3264"/>
+        <w:gridCol w:w="3264"/>
+      </w:tblGrid>
+      <w:tr>
+        <w:tc>
+          <w:tcPr>
+            <w:tcW w:type="dxa" w:w="1008"/>
+            <w:shd w:fill="122033"/>
+            <w:vAlign w:val="center"/>
+          </w:tcPr>
+          <w:p>
+            <w:pPr>
+              <w:spacing w:after="0"/>
+            </w:pPr>
+            <w:r/>
+            <w:r>
+              <w:rPr>
+                <w:rFonts w:ascii="맑은 고딕" w:hAnsi="맑은 고딕" w:eastAsia="맑은 고딕"/>
+                <w:b/>
+                <w:color w:val="FFFFFF"/>
+                <w:sz w:val="18"/>
+              </w:rPr>
+              <w:t>순서</w:t>
+            </w:r>
+          </w:p>
+        </w:tc>
+        <w:tc>
+          <w:tcPr>
+            <w:tcW w:type="dxa" w:w="2592"/>
+            <w:shd w:fill="122033"/>
+            <w:vAlign w:val="center"/>
+          </w:tcPr>
+          <w:p>
+            <w:pPr>
+              <w:spacing w:after="0"/>
+            </w:pPr>
+            <w:r/>
+            <w:r>
+              <w:rPr>
+                <w:rFonts w:ascii="맑은 고딕" w:hAnsi="맑은 고딕" w:eastAsia="맑은 고딕"/>
+                <w:b/>
+                <w:color w:val="FFFFFF"/>
+                <w:sz w:val="18"/>
+              </w:rPr>
+              <w:t>처리 위치</w:t>
+            </w:r>
+          </w:p>
+        </w:tc>
+        <w:tc>
+          <w:tcPr>
+            <w:tcW w:type="dxa" w:w="6768"/>
+            <w:shd w:fill="122033"/>
+            <w:vAlign w:val="center"/>
+          </w:tcPr>
+          <w:p>
+            <w:pPr>
+              <w:spacing w:after="0"/>
+            </w:pPr>
+            <w:r/>
+            <w:r>
+              <w:rPr>
+                <w:rFonts w:ascii="맑은 고딕" w:hAnsi="맑은 고딕" w:eastAsia="맑은 고딕"/>
+                <w:b/>
+                <w:color w:val="FFFFFF"/>
+                <w:sz w:val="18"/>
+              </w:rPr>
+              <w:t>설명</w:t>
+            </w:r>
+          </w:p>
+        </w:tc>
+      </w:tr>
+      <w:tr>
+        <w:tc>
+          <w:tcPr>
+            <w:tcW w:type="dxa" w:w="1008"/>
+            <w:vAlign w:val="center"/>
+          </w:tcPr>
+          <w:p>
+            <w:pPr>
+              <w:spacing w:after="0"/>
+            </w:pPr>
+            <w:r/>
+            <w:r>
+              <w:rPr>
+                <w:rFonts w:ascii="맑은 고딕" w:hAnsi="맑은 고딕" w:eastAsia="맑은 고딕"/>
+                <w:b w:val="0"/>
+                <w:sz w:val="18"/>
+              </w:rPr>
+              <w:t>1</w:t>
+            </w:r>
+          </w:p>
+        </w:tc>
+        <w:tc>
+          <w:tcPr>
+            <w:tcW w:type="dxa" w:w="2592"/>
+            <w:vAlign w:val="center"/>
+          </w:tcPr>
+          <w:p>
+            <w:pPr>
+              <w:spacing w:after="0"/>
+            </w:pPr>
+            <w:r/>
+            <w:r>
+              <w:rPr>
+                <w:rFonts w:ascii="맑은 고딕" w:hAnsi="맑은 고딕" w:eastAsia="맑은 고딕"/>
+                <w:b w:val="0"/>
+                <w:sz w:val="18"/>
+              </w:rPr>
+              <w:t>브라우저</w:t>
+            </w:r>
+          </w:p>
+        </w:tc>
+        <w:tc>
+          <w:tcPr>
+            <w:tcW w:type="dxa" w:w="6768"/>
+            <w:vAlign w:val="center"/>
+          </w:tcPr>
+          <w:p>
+            <w:pPr>
+              <w:spacing w:after="0"/>
+            </w:pPr>
+            <w:r/>
+            <w:r>
+              <w:rPr>
+                <w:rFonts w:ascii="맑은 고딕" w:hAnsi="맑은 고딕" w:eastAsia="맑은 고딕"/>
+                <w:b w:val="0"/>
+                <w:sz w:val="18"/>
+              </w:rPr>
+              <w:t>종목 상세 화면에서 수량 입력 후 매수 버튼 클릭</w:t>
+            </w:r>
+          </w:p>
+        </w:tc>
+      </w:tr>
+      <w:tr>
+        <w:tc>
+          <w:tcPr>
+            <w:tcW w:type="dxa" w:w="1008"/>
+            <w:shd w:fill="F6F9FD"/>
+            <w:vAlign w:val="center"/>
+          </w:tcPr>
+          <w:p>
+            <w:pPr>
+              <w:spacing w:after="0"/>
+            </w:pPr>
+            <w:r/>
+            <w:r>
+              <w:rPr>
+                <w:rFonts w:ascii="맑은 고딕" w:hAnsi="맑은 고딕" w:eastAsia="맑은 고딕"/>
+                <w:b w:val="0"/>
+                <w:sz w:val="18"/>
+              </w:rPr>
+              <w:t>2</w:t>
+            </w:r>
+          </w:p>
+        </w:tc>
+        <w:tc>
+          <w:tcPr>
+            <w:tcW w:type="dxa" w:w="2592"/>
+            <w:shd w:fill="F6F9FD"/>
+            <w:vAlign w:val="center"/>
+          </w:tcPr>
+          <w:p>
+            <w:pPr>
+              <w:spacing w:after="0"/>
+            </w:pPr>
+            <w:r/>
+            <w:r>
+              <w:rPr>
+                <w:rFonts w:ascii="맑은 고딕" w:hAnsi="맑은 고딕" w:eastAsia="맑은 고딕"/>
+                <w:b w:val="0"/>
+                <w:sz w:val="18"/>
+              </w:rPr>
+              <w:t>MiniHandler</w:t>
+            </w:r>
+          </w:p>
+        </w:tc>
+        <w:tc>
+          <w:tcPr>
+            <w:tcW w:type="dxa" w:w="6768"/>
+            <w:shd w:fill="F6F9FD"/>
+            <w:vAlign w:val="center"/>
+          </w:tcPr>
+          <w:p>
+            <w:pPr>
+              <w:spacing w:after="0"/>
+            </w:pPr>
+            <w:r/>
+            <w:r>
+              <w:rPr>
+                <w:rFonts w:ascii="맑은 고딕" w:hAnsi="맑은 고딕" w:eastAsia="맑은 고딕"/>
+                <w:b w:val="0"/>
+                <w:sz w:val="18"/>
+              </w:rPr>
+              <w:t>POST /api/stock/buy 요청 body를 읽고 MiniProject로 전달</w:t>
+            </w:r>
+          </w:p>
+        </w:tc>
+      </w:tr>
+      <w:tr>
+        <w:tc>
+          <w:tcPr>
+            <w:tcW w:type="dxa" w:w="1008"/>
+            <w:vAlign w:val="center"/>
+          </w:tcPr>
+          <w:p>
+            <w:pPr>
+              <w:spacing w:after="0"/>
+            </w:pPr>
+            <w:r/>
+            <w:r>
+              <w:rPr>
+                <w:rFonts w:ascii="맑은 고딕" w:hAnsi="맑은 고딕" w:eastAsia="맑은 고딕"/>
+                <w:b w:val="0"/>
+                <w:sz w:val="18"/>
+              </w:rPr>
+              <w:t>3</w:t>
+            </w:r>
+          </w:p>
+        </w:tc>
+        <w:tc>
+          <w:tcPr>
+            <w:tcW w:type="dxa" w:w="2592"/>
+            <w:vAlign w:val="center"/>
+          </w:tcPr>
+          <w:p>
+            <w:pPr>
+              <w:spacing w:after="0"/>
+            </w:pPr>
+            <w:r/>
+            <w:r>
+              <w:rPr>
+                <w:rFonts w:ascii="맑은 고딕" w:hAnsi="맑은 고딕" w:eastAsia="맑은 고딕"/>
+                <w:b w:val="0"/>
+                <w:sz w:val="18"/>
+              </w:rPr>
+              <w:t>MiniProject</w:t>
+            </w:r>
+          </w:p>
+        </w:tc>
+        <w:tc>
+          <w:tcPr>
+            <w:tcW w:type="dxa" w:w="6768"/>
+            <w:vAlign w:val="center"/>
+          </w:tcPr>
+          <w:p>
+            <w:pPr>
+              <w:spacing w:after="0"/>
+            </w:pPr>
+            <w:r/>
+            <w:r>
+              <w:rPr>
+                <w:rFonts w:ascii="맑은 고딕" w:hAnsi="맑은 고딕" w:eastAsia="맑은 고딕"/>
+                <w:b w:val="0"/>
+                <w:sz w:val="18"/>
+              </w:rPr>
+              <w:t>현재가 × 수량 계산, 잔액 부족 여부 확인, 보유 종목 갱신</w:t>
+            </w:r>
+          </w:p>
+        </w:tc>
+      </w:tr>
+      <w:tr>
+        <w:tc>
+          <w:tcPr>
+            <w:tcW w:type="dxa" w:w="1008"/>
+            <w:shd w:fill="F6F9FD"/>
+            <w:vAlign w:val="center"/>
+          </w:tcPr>
+          <w:p>
+            <w:pPr>
+              <w:spacing w:after="0"/>
+            </w:pPr>
+            <w:r/>
+            <w:r>
+              <w:rPr>
+                <w:rFonts w:ascii="맑은 고딕" w:hAnsi="맑은 고딕" w:eastAsia="맑은 고딕"/>
+                <w:b w:val="0"/>
+                <w:sz w:val="18"/>
+              </w:rPr>
+              <w:t>4</w:t>
+            </w:r>
+          </w:p>
+        </w:tc>
+        <w:tc>
+          <w:tcPr>
+            <w:tcW w:type="dxa" w:w="2592"/>
+            <w:shd w:fill="F6F9FD"/>
+            <w:vAlign w:val="center"/>
+          </w:tcPr>
+          <w:p>
+            <w:pPr>
+              <w:spacing w:after="0"/>
+            </w:pPr>
+            <w:r/>
+            <w:r>
+              <w:rPr>
+                <w:rFonts w:ascii="맑은 고딕" w:hAnsi="맑은 고딕" w:eastAsia="맑은 고딕"/>
+                <w:b w:val="0"/>
+                <w:sz w:val="18"/>
+              </w:rPr>
+              <w:t>MySqlDatabase</w:t>
+            </w:r>
+          </w:p>
+        </w:tc>
+        <w:tc>
+          <w:tcPr>
+            <w:tcW w:type="dxa" w:w="6768"/>
+            <w:shd w:fill="F6F9FD"/>
+            <w:vAlign w:val="center"/>
+          </w:tcPr>
+          <w:p>
+            <w:pPr>
+              <w:spacing w:after="0"/>
+            </w:pPr>
+            <w:r/>
+            <w:r>
+              <w:rPr>
+                <w:rFonts w:ascii="맑은 고딕" w:hAnsi="맑은 고딕" w:eastAsia="맑은 고딕"/>
+                <w:b w:val="0"/>
+                <w:sz w:val="18"/>
+              </w:rPr>
+              <w:t>members, shares, trade_logs 테이블에 저장</w:t>
+            </w:r>
+          </w:p>
+        </w:tc>
+      </w:tr>
+      <w:tr>
+        <w:tc>
+          <w:tcPr>
+            <w:tcW w:type="dxa" w:w="1008"/>
+            <w:vAlign w:val="center"/>
+          </w:tcPr>
+          <w:p>
+            <w:pPr>
+              <w:spacing w:after="0"/>
+            </w:pPr>
+            <w:r/>
+            <w:r>
+              <w:rPr>
+                <w:rFonts w:ascii="맑은 고딕" w:hAnsi="맑은 고딕" w:eastAsia="맑은 고딕"/>
+                <w:b w:val="0"/>
+                <w:sz w:val="18"/>
+              </w:rPr>
+              <w:t>5</w:t>
+            </w:r>
+          </w:p>
+        </w:tc>
+        <w:tc>
+          <w:tcPr>
+            <w:tcW w:type="dxa" w:w="2592"/>
+            <w:vAlign w:val="center"/>
+          </w:tcPr>
+          <w:p>
+            <w:pPr>
+              <w:spacing w:after="0"/>
+            </w:pPr>
+            <w:r/>
+            <w:r>
+              <w:rPr>
+                <w:rFonts w:ascii="맑은 고딕" w:hAnsi="맑은 고딕" w:eastAsia="맑은 고딕"/>
+                <w:b w:val="0"/>
+                <w:sz w:val="18"/>
+              </w:rPr>
+              <w:t>브라우저</w:t>
+            </w:r>
+          </w:p>
+        </w:tc>
+        <w:tc>
+          <w:tcPr>
+            <w:tcW w:type="dxa" w:w="6768"/>
+            <w:vAlign w:val="center"/>
+          </w:tcPr>
+          <w:p>
+            <w:pPr>
+              <w:spacing w:after="0"/>
+            </w:pPr>
+            <w:r/>
+            <w:r>
+              <w:rPr>
+                <w:rFonts w:ascii="맑은 고딕" w:hAnsi="맑은 고딕" w:eastAsia="맑은 고딕"/>
+                <w:b w:val="0"/>
+                <w:sz w:val="18"/>
+              </w:rPr>
+              <w:t>GET /api/state로 최신 현금, 평가금액, 손익률 다시 표시</w:t>
+            </w:r>
+          </w:p>
+        </w:tc>
+      </w:tr>
+    </w:tbl>
+    <w:p/>
     <w:p>
       <w:pPr>
         <w:spacing w:before="60" w:after="120"/>
@@ -4667,6 +5487,285 @@
     </w:p>
     <w:p>
       <w:pPr>
+        <w:spacing w:after="120"/>
+      </w:pPr>
+      <w:r>
+        <w:t>members는 모의 계좌의 현금 잔액을 보관한다. shares는 종목별 보유 수량과 총 매입금액을 저장한다. 평균단가를 별도 컬럼으로 저장하지 않은 이유는 quantity와 purchase_price가 있으면 평균단가를 purchase_price / quantity로 계산할 수 있기 때문이다. trade_logs는 매수와 매도 기록을 시간순으로 남겨 나중에 거래 내역과 수익률 분석을 확장할 수 있게 한다.</w:t>
+      </w:r>
+    </w:p>
+    <w:tbl>
+      <w:tblPr>
+        <w:tblStyle w:val="TableGrid"/>
+        <w:tblW w:type="auto" w:w="0"/>
+        <w:jc w:val="center"/>
+        <w:tblLook w:firstColumn="1" w:firstRow="1" w:lastColumn="0" w:lastRow="0" w:noHBand="0" w:noVBand="1" w:val="04A0"/>
+      </w:tblPr>
+      <w:tblGrid>
+        <w:gridCol w:w="3264"/>
+        <w:gridCol w:w="3264"/>
+        <w:gridCol w:w="3264"/>
+      </w:tblGrid>
+      <w:tr>
+        <w:tc>
+          <w:tcPr>
+            <w:tcW w:type="dxa" w:w="1872"/>
+            <w:shd w:fill="122033"/>
+            <w:vAlign w:val="center"/>
+          </w:tcPr>
+          <w:p>
+            <w:pPr>
+              <w:spacing w:after="0"/>
+            </w:pPr>
+            <w:r/>
+            <w:r>
+              <w:rPr>
+                <w:rFonts w:ascii="맑은 고딕" w:hAnsi="맑은 고딕" w:eastAsia="맑은 고딕"/>
+                <w:b/>
+                <w:color w:val="FFFFFF"/>
+                <w:sz w:val="18"/>
+              </w:rPr>
+              <w:t>테이블</w:t>
+            </w:r>
+          </w:p>
+        </w:tc>
+        <w:tc>
+          <w:tcPr>
+            <w:tcW w:type="dxa" w:w="4320"/>
+            <w:shd w:fill="122033"/>
+            <w:vAlign w:val="center"/>
+          </w:tcPr>
+          <w:p>
+            <w:pPr>
+              <w:spacing w:after="0"/>
+            </w:pPr>
+            <w:r/>
+            <w:r>
+              <w:rPr>
+                <w:rFonts w:ascii="맑은 고딕" w:hAnsi="맑은 고딕" w:eastAsia="맑은 고딕"/>
+                <w:b/>
+                <w:color w:val="FFFFFF"/>
+                <w:sz w:val="18"/>
+              </w:rPr>
+              <w:t>핵심 컬럼</w:t>
+            </w:r>
+          </w:p>
+        </w:tc>
+        <w:tc>
+          <w:tcPr>
+            <w:tcW w:type="dxa" w:w="4320"/>
+            <w:shd w:fill="122033"/>
+            <w:vAlign w:val="center"/>
+          </w:tcPr>
+          <w:p>
+            <w:pPr>
+              <w:spacing w:after="0"/>
+            </w:pPr>
+            <w:r/>
+            <w:r>
+              <w:rPr>
+                <w:rFonts w:ascii="맑은 고딕" w:hAnsi="맑은 고딕" w:eastAsia="맑은 고딕"/>
+                <w:b/>
+                <w:color w:val="FFFFFF"/>
+                <w:sz w:val="18"/>
+              </w:rPr>
+              <w:t>설계 이유</w:t>
+            </w:r>
+          </w:p>
+        </w:tc>
+      </w:tr>
+      <w:tr>
+        <w:tc>
+          <w:tcPr>
+            <w:tcW w:type="dxa" w:w="1872"/>
+            <w:vAlign w:val="center"/>
+          </w:tcPr>
+          <w:p>
+            <w:pPr>
+              <w:spacing w:after="0"/>
+            </w:pPr>
+            <w:r/>
+            <w:r>
+              <w:rPr>
+                <w:rFonts w:ascii="맑은 고딕" w:hAnsi="맑은 고딕" w:eastAsia="맑은 고딕"/>
+                <w:b w:val="0"/>
+                <w:sz w:val="18"/>
+              </w:rPr>
+              <w:t>members</w:t>
+            </w:r>
+          </w:p>
+        </w:tc>
+        <w:tc>
+          <w:tcPr>
+            <w:tcW w:type="dxa" w:w="4320"/>
+            <w:vAlign w:val="center"/>
+          </w:tcPr>
+          <w:p>
+            <w:pPr>
+              <w:spacing w:after="0"/>
+            </w:pPr>
+            <w:r/>
+            <w:r>
+              <w:rPr>
+                <w:rFonts w:ascii="맑은 고딕" w:hAnsi="맑은 고딕" w:eastAsia="맑은 고딕"/>
+                <w:b w:val="0"/>
+                <w:sz w:val="18"/>
+              </w:rPr>
+              <w:t>uid, name, balance</w:t>
+            </w:r>
+          </w:p>
+        </w:tc>
+        <w:tc>
+          <w:tcPr>
+            <w:tcW w:type="dxa" w:w="4320"/>
+            <w:vAlign w:val="center"/>
+          </w:tcPr>
+          <w:p>
+            <w:pPr>
+              <w:spacing w:after="0"/>
+            </w:pPr>
+            <w:r/>
+            <w:r>
+              <w:rPr>
+                <w:rFonts w:ascii="맑은 고딕" w:hAnsi="맑은 고딕" w:eastAsia="맑은 고딕"/>
+                <w:b w:val="0"/>
+                <w:sz w:val="18"/>
+              </w:rPr>
+              <w:t>단일 모의 계좌의 식별값과 현금 잔액을 유지</w:t>
+            </w:r>
+          </w:p>
+        </w:tc>
+      </w:tr>
+      <w:tr>
+        <w:tc>
+          <w:tcPr>
+            <w:tcW w:type="dxa" w:w="1872"/>
+            <w:shd w:fill="F6F9FD"/>
+            <w:vAlign w:val="center"/>
+          </w:tcPr>
+          <w:p>
+            <w:pPr>
+              <w:spacing w:after="0"/>
+            </w:pPr>
+            <w:r/>
+            <w:r>
+              <w:rPr>
+                <w:rFonts w:ascii="맑은 고딕" w:hAnsi="맑은 고딕" w:eastAsia="맑은 고딕"/>
+                <w:b w:val="0"/>
+                <w:sz w:val="18"/>
+              </w:rPr>
+              <w:t>shares</w:t>
+            </w:r>
+          </w:p>
+        </w:tc>
+        <w:tc>
+          <w:tcPr>
+            <w:tcW w:type="dxa" w:w="4320"/>
+            <w:shd w:fill="F6F9FD"/>
+            <w:vAlign w:val="center"/>
+          </w:tcPr>
+          <w:p>
+            <w:pPr>
+              <w:spacing w:after="0"/>
+            </w:pPr>
+            <w:r/>
+            <w:r>
+              <w:rPr>
+                <w:rFonts w:ascii="맑은 고딕" w:hAnsi="맑은 고딕" w:eastAsia="맑은 고딕"/>
+                <w:b w:val="0"/>
+                <w:sz w:val="18"/>
+              </w:rPr>
+              <w:t>member_uid, stock_name, quantity, purchase_price</w:t>
+            </w:r>
+          </w:p>
+        </w:tc>
+        <w:tc>
+          <w:tcPr>
+            <w:tcW w:type="dxa" w:w="4320"/>
+            <w:shd w:fill="F6F9FD"/>
+            <w:vAlign w:val="center"/>
+          </w:tcPr>
+          <w:p>
+            <w:pPr>
+              <w:spacing w:after="0"/>
+            </w:pPr>
+            <w:r/>
+            <w:r>
+              <w:rPr>
+                <w:rFonts w:ascii="맑은 고딕" w:hAnsi="맑은 고딕" w:eastAsia="맑은 고딕"/>
+                <w:b w:val="0"/>
+                <w:sz w:val="18"/>
+              </w:rPr>
+              <w:t>보유 수량과 총 매입금액을 저장해 평가금액과 평균단가 계산</w:t>
+            </w:r>
+          </w:p>
+        </w:tc>
+      </w:tr>
+      <w:tr>
+        <w:tc>
+          <w:tcPr>
+            <w:tcW w:type="dxa" w:w="1872"/>
+            <w:vAlign w:val="center"/>
+          </w:tcPr>
+          <w:p>
+            <w:pPr>
+              <w:spacing w:after="0"/>
+            </w:pPr>
+            <w:r/>
+            <w:r>
+              <w:rPr>
+                <w:rFonts w:ascii="맑은 고딕" w:hAnsi="맑은 고딕" w:eastAsia="맑은 고딕"/>
+                <w:b w:val="0"/>
+                <w:sz w:val="18"/>
+              </w:rPr>
+              <w:t>trade_logs</w:t>
+            </w:r>
+          </w:p>
+        </w:tc>
+        <w:tc>
+          <w:tcPr>
+            <w:tcW w:type="dxa" w:w="4320"/>
+            <w:vAlign w:val="center"/>
+          </w:tcPr>
+          <w:p>
+            <w:pPr>
+              <w:spacing w:after="0"/>
+            </w:pPr>
+            <w:r/>
+            <w:r>
+              <w:rPr>
+                <w:rFonts w:ascii="맑은 고딕" w:hAnsi="맑은 고딕" w:eastAsia="맑은 고딕"/>
+                <w:b w:val="0"/>
+                <w:sz w:val="18"/>
+              </w:rPr>
+              <w:t>id, member_uid, stock_name, quantity, price, trade_type, traded_at</w:t>
+            </w:r>
+          </w:p>
+        </w:tc>
+        <w:tc>
+          <w:tcPr>
+            <w:tcW w:type="dxa" w:w="4320"/>
+            <w:vAlign w:val="center"/>
+          </w:tcPr>
+          <w:p>
+            <w:pPr>
+              <w:spacing w:after="0"/>
+            </w:pPr>
+            <w:r/>
+            <w:r>
+              <w:rPr>
+                <w:rFonts w:ascii="맑은 고딕" w:hAnsi="맑은 고딕" w:eastAsia="맑은 고딕"/>
+                <w:b w:val="0"/>
+                <w:sz w:val="18"/>
+              </w:rPr>
+              <w:t>매수/매도 기록을 남겨 거래 이력과 통계 확장에 활용</w:t>
+            </w:r>
+          </w:p>
+        </w:tc>
+      </w:tr>
+    </w:tbl>
+    <w:p/>
+    <w:p>
+      <w:pPr>
         <w:pStyle w:val="Heading2"/>
       </w:pPr>
       <w:r>

</xml_diff>